<commit_message>
Update of RAS - The Life of Tycho Brahe 21.03.2026
</commit_message>
<xml_diff>
--- a/Main meeting 21.03.2026 - The Life Of Tycho Brahe/RAS - The Life of Tycho Brahe 21.03.2026 notes.docx
+++ b/Main meeting 21.03.2026 - The Life Of Tycho Brahe/RAS - The Life of Tycho Brahe 21.03.2026 notes.docx
@@ -18,6 +18,45 @@
           <w:sz w:val="32"/>
           <w:szCs w:val="32"/>
         </w:rPr>
+        <w:t>Uraniborg</w:t>
+      </w:r>
+    </w:p>
+    <w:p>
+      <w:pPr>
+        <w:rPr>
+          <w:b/>
+          <w:bCs/>
+          <w:sz w:val="32"/>
+          <w:szCs w:val="32"/>
+        </w:rPr>
+      </w:pPr>
+      <w:r>
+        <w:rPr>
+          <w:b/>
+          <w:bCs/>
+          <w:sz w:val="32"/>
+          <w:szCs w:val="32"/>
+        </w:rPr>
+        <w:br w:type="page"/>
+      </w:r>
+    </w:p>
+    <w:p>
+      <w:pPr>
+        <w:rPr>
+          <w:b/>
+          <w:bCs/>
+          <w:sz w:val="32"/>
+          <w:szCs w:val="32"/>
+        </w:rPr>
+      </w:pPr>
+      <w:r>
+        <w:rPr>
+          <w:b/>
+          <w:bCs/>
+          <w:sz w:val="32"/>
+          <w:szCs w:val="32"/>
+        </w:rPr>
+        <w:lastRenderedPageBreak/>
         <w:t>Uraniborg elevation</w:t>
       </w:r>
     </w:p>
@@ -1294,17 +1333,28 @@
           <w:szCs w:val="32"/>
         </w:rPr>
         <w:lastRenderedPageBreak/>
-        <w:t>Armillary Sphere</w:t>
-      </w:r>
-    </w:p>
-    <w:p>
-      <w:pPr>
+        <w:t>Zodiacal a</w:t>
+      </w:r>
+      <w:r>
         <w:rPr>
           <w:b/>
           <w:bCs/>
           <w:sz w:val="32"/>
           <w:szCs w:val="32"/>
         </w:rPr>
+        <w:t>rmillary Sphere</w:t>
+      </w:r>
+    </w:p>
+    <w:p>
+      <w:pPr>
+        <w:numPr>
+          <w:ilvl w:val="0"/>
+          <w:numId w:val="18"/>
+        </w:numPr>
+        <w:rPr>
+          <w:sz w:val="32"/>
+          <w:szCs w:val="32"/>
+        </w:rPr>
       </w:pPr>
       <w:r>
         <w:rPr>
@@ -1313,17 +1363,54 @@
           <w:sz w:val="32"/>
           <w:szCs w:val="32"/>
         </w:rPr>
-        <w:br w:type="page"/>
-      </w:r>
-    </w:p>
-    <w:p>
-      <w:pPr>
+        <w:t>Reduced Design:</w:t>
+      </w:r>
+      <w:r>
+        <w:rPr>
+          <w:sz w:val="32"/>
+          <w:szCs w:val="32"/>
+        </w:rPr>
+        <w:t> Unlike previous complex instruments, Tycho utilized only four rings—the zodiacal, two colures, and a declination circle—making it more stable and precise.</w:t>
+      </w:r>
+    </w:p>
+    <w:p>
+      <w:pPr>
+        <w:numPr>
+          <w:ilvl w:val="0"/>
+          <w:numId w:val="18"/>
+        </w:numPr>
+        <w:rPr>
+          <w:sz w:val="32"/>
+          <w:szCs w:val="32"/>
+        </w:rPr>
+      </w:pPr>
+      <w:r>
         <w:rPr>
           <w:b/>
           <w:bCs/>
           <w:sz w:val="32"/>
           <w:szCs w:val="32"/>
         </w:rPr>
+        <w:t>Ecliptic Focus:</w:t>
+      </w:r>
+      <w:r>
+        <w:rPr>
+          <w:sz w:val="32"/>
+          <w:szCs w:val="32"/>
+        </w:rPr>
+        <w:t> The instrument allowed direct measurement of celestial bodies' longitude and latitude relative to the ecliptic (the sun's path), rather than just equatorial coordinates.</w:t>
+      </w:r>
+    </w:p>
+    <w:p>
+      <w:pPr>
+        <w:numPr>
+          <w:ilvl w:val="0"/>
+          <w:numId w:val="18"/>
+        </w:numPr>
+        <w:rPr>
+          <w:sz w:val="32"/>
+          <w:szCs w:val="32"/>
+        </w:rPr>
       </w:pPr>
       <w:r>
         <w:rPr>
@@ -1332,6 +1419,131 @@
           <w:sz w:val="32"/>
           <w:szCs w:val="32"/>
         </w:rPr>
+        <w:t>Accuracy:</w:t>
+      </w:r>
+      <w:r>
+        <w:rPr>
+          <w:sz w:val="32"/>
+          <w:szCs w:val="32"/>
+        </w:rPr>
+        <w:t xml:space="preserve"> It was designed with large radius circles to increase the precision of his observations, which were vital for creating his improved star </w:t>
+      </w:r>
+      <w:proofErr w:type="spellStart"/>
+      <w:r>
+        <w:rPr>
+          <w:sz w:val="32"/>
+          <w:szCs w:val="32"/>
+        </w:rPr>
+        <w:t>catalog</w:t>
+      </w:r>
+      <w:proofErr w:type="spellEnd"/>
+      <w:r>
+        <w:rPr>
+          <w:sz w:val="32"/>
+          <w:szCs w:val="32"/>
+        </w:rPr>
+        <w:t xml:space="preserve"> and mapping planetary motions.</w:t>
+      </w:r>
+    </w:p>
+    <w:p>
+      <w:pPr>
+        <w:numPr>
+          <w:ilvl w:val="0"/>
+          <w:numId w:val="18"/>
+        </w:numPr>
+        <w:rPr>
+          <w:sz w:val="32"/>
+          <w:szCs w:val="32"/>
+        </w:rPr>
+      </w:pPr>
+      <w:r>
+        <w:rPr>
+          <w:b/>
+          <w:bCs/>
+          <w:sz w:val="32"/>
+          <w:szCs w:val="32"/>
+        </w:rPr>
+        <w:t>Mounting:</w:t>
+      </w:r>
+      <w:r>
+        <w:rPr>
+          <w:sz w:val="32"/>
+          <w:szCs w:val="32"/>
+        </w:rPr>
+        <w:t> It was mounted on a stable base and aligned with the meridian to allow for precise tracking.</w:t>
+      </w:r>
+    </w:p>
+    <w:p>
+      <w:pPr>
+        <w:numPr>
+          <w:ilvl w:val="0"/>
+          <w:numId w:val="18"/>
+        </w:numPr>
+        <w:rPr>
+          <w:sz w:val="32"/>
+          <w:szCs w:val="32"/>
+        </w:rPr>
+      </w:pPr>
+      <w:r>
+        <w:rPr>
+          <w:b/>
+          <w:bCs/>
+          <w:sz w:val="32"/>
+          <w:szCs w:val="32"/>
+        </w:rPr>
+        <w:t>Application:</w:t>
+      </w:r>
+      <w:r>
+        <w:rPr>
+          <w:sz w:val="32"/>
+          <w:szCs w:val="32"/>
+        </w:rPr>
+        <w:t> It enabled him to measure the zodiacal longitude and latitude of stars and planets without heavy subsequent calculations. </w:t>
+      </w:r>
+    </w:p>
+    <w:p>
+      <w:pPr>
+        <w:rPr>
+          <w:sz w:val="32"/>
+          <w:szCs w:val="32"/>
+        </w:rPr>
+      </w:pPr>
+    </w:p>
+    <w:p>
+      <w:pPr>
+        <w:rPr>
+          <w:b/>
+          <w:bCs/>
+          <w:sz w:val="32"/>
+          <w:szCs w:val="32"/>
+        </w:rPr>
+      </w:pPr>
+      <w:r>
+        <w:rPr>
+          <w:b/>
+          <w:bCs/>
+          <w:sz w:val="32"/>
+          <w:szCs w:val="32"/>
+        </w:rPr>
+        <w:br w:type="page"/>
+      </w:r>
+    </w:p>
+    <w:p>
+      <w:pPr>
+        <w:rPr>
+          <w:b/>
+          <w:bCs/>
+          <w:sz w:val="32"/>
+          <w:szCs w:val="32"/>
+        </w:rPr>
+      </w:pPr>
+      <w:r>
+        <w:rPr>
+          <w:b/>
+          <w:bCs/>
+          <w:sz w:val="32"/>
+          <w:szCs w:val="32"/>
+        </w:rPr>
         <w:lastRenderedPageBreak/>
         <w:t>Mural Quadrant</w:t>
       </w:r>
@@ -1631,21 +1843,7 @@
           <w:sz w:val="32"/>
           <w:szCs w:val="32"/>
         </w:rPr>
-        <w:t xml:space="preserve">Johannes Stenwinckel </w:t>
-      </w:r>
-      <w:r>
-        <w:rPr>
-          <w:sz w:val="32"/>
-          <w:szCs w:val="32"/>
-        </w:rPr>
-        <w:t xml:space="preserve">painted </w:t>
-      </w:r>
-      <w:r>
-        <w:rPr>
-          <w:sz w:val="32"/>
-          <w:szCs w:val="32"/>
-        </w:rPr>
-        <w:t xml:space="preserve">the building and its contents by my architect of Emden; </w:t>
+        <w:t xml:space="preserve">Johannes Stenwinckel painted the building and its contents by my architect of Emden; </w:t>
       </w:r>
     </w:p>
     <w:p>
@@ -1665,14 +1863,7 @@
           <w:sz w:val="32"/>
           <w:szCs w:val="32"/>
         </w:rPr>
-        <w:t>Johannes of Antwerp</w:t>
-      </w:r>
-      <w:r>
-        <w:rPr>
-          <w:sz w:val="32"/>
-          <w:szCs w:val="32"/>
-        </w:rPr>
-        <w:t xml:space="preserve"> </w:t>
+        <w:t xml:space="preserve">Johannes of Antwerp </w:t>
       </w:r>
       <w:r>
         <w:rPr>
@@ -1824,6 +2015,2233 @@
         <w:rPr>
           <w:b/>
           <w:bCs/>
+          <w:sz w:val="32"/>
+          <w:szCs w:val="32"/>
+        </w:rPr>
+      </w:pPr>
+      <w:r>
+        <w:rPr>
+          <w:b/>
+          <w:bCs/>
+          <w:sz w:val="32"/>
+          <w:szCs w:val="32"/>
+        </w:rPr>
+        <w:lastRenderedPageBreak/>
+        <w:t>Large brass globe</w:t>
+      </w:r>
+    </w:p>
+    <w:p>
+      <w:pPr>
+        <w:numPr>
+          <w:ilvl w:val="0"/>
+          <w:numId w:val="19"/>
+        </w:numPr>
+        <w:rPr>
+          <w:sz w:val="32"/>
+          <w:szCs w:val="32"/>
+        </w:rPr>
+      </w:pPr>
+      <w:r>
+        <w:rPr>
+          <w:sz w:val="32"/>
+          <w:szCs w:val="32"/>
+        </w:rPr>
+        <w:t>Large globe</w:t>
+      </w:r>
+      <w:r>
+        <w:rPr>
+          <w:sz w:val="32"/>
+          <w:szCs w:val="32"/>
+        </w:rPr>
+        <w:t xml:space="preserve">, </w:t>
+      </w:r>
+      <w:r>
+        <w:rPr>
+          <w:sz w:val="32"/>
+          <w:szCs w:val="32"/>
+        </w:rPr>
+        <w:t xml:space="preserve">~5 </w:t>
+      </w:r>
+      <w:r>
+        <w:rPr>
+          <w:sz w:val="32"/>
+          <w:szCs w:val="32"/>
+        </w:rPr>
+        <w:t xml:space="preserve">(1.5 – 1.6m) </w:t>
+      </w:r>
+      <w:r>
+        <w:rPr>
+          <w:sz w:val="32"/>
+          <w:szCs w:val="32"/>
+        </w:rPr>
+        <w:t>feet</w:t>
+      </w:r>
+      <w:r>
+        <w:rPr>
+          <w:sz w:val="32"/>
+          <w:szCs w:val="32"/>
+        </w:rPr>
+        <w:t xml:space="preserve"> in diameter</w:t>
+      </w:r>
+      <w:r>
+        <w:rPr>
+          <w:sz w:val="32"/>
+          <w:szCs w:val="32"/>
+        </w:rPr>
+        <w:t>,</w:t>
+      </w:r>
+      <w:r>
+        <w:rPr>
+          <w:sz w:val="32"/>
+          <w:szCs w:val="32"/>
+        </w:rPr>
+        <w:t xml:space="preserve"> </w:t>
+      </w:r>
+      <w:r>
+        <w:rPr>
+          <w:sz w:val="32"/>
+          <w:szCs w:val="32"/>
+        </w:rPr>
+        <w:t>made with great care and no small cost</w:t>
+      </w:r>
+      <w:r>
+        <w:rPr>
+          <w:sz w:val="32"/>
+          <w:szCs w:val="32"/>
+        </w:rPr>
+        <w:t>. Commissioned by Tycho in 1570.</w:t>
+      </w:r>
+    </w:p>
+    <w:p>
+      <w:pPr>
+        <w:numPr>
+          <w:ilvl w:val="0"/>
+          <w:numId w:val="19"/>
+        </w:numPr>
+        <w:rPr>
+          <w:sz w:val="32"/>
+          <w:szCs w:val="32"/>
+        </w:rPr>
+      </w:pPr>
+      <w:r>
+        <w:rPr>
+          <w:sz w:val="32"/>
+          <w:szCs w:val="32"/>
+        </w:rPr>
+        <w:t>Inside made of wood from many rings and small pieces fitted together and supported at the centre</w:t>
+      </w:r>
+    </w:p>
+    <w:p>
+      <w:pPr>
+        <w:numPr>
+          <w:ilvl w:val="0"/>
+          <w:numId w:val="19"/>
+        </w:numPr>
+        <w:rPr>
+          <w:sz w:val="32"/>
+          <w:szCs w:val="32"/>
+        </w:rPr>
+      </w:pPr>
+      <w:r>
+        <w:rPr>
+          <w:sz w:val="32"/>
+          <w:szCs w:val="32"/>
+        </w:rPr>
+        <w:t>Because of its great size making transport difficult, it remained in Augsburg for 5 years</w:t>
+      </w:r>
+    </w:p>
+    <w:p>
+      <w:pPr>
+        <w:numPr>
+          <w:ilvl w:val="0"/>
+          <w:numId w:val="19"/>
+        </w:numPr>
+        <w:rPr>
+          <w:sz w:val="32"/>
+          <w:szCs w:val="32"/>
+        </w:rPr>
+      </w:pPr>
+      <w:r>
+        <w:rPr>
+          <w:sz w:val="32"/>
+          <w:szCs w:val="32"/>
+        </w:rPr>
+        <w:t>S</w:t>
+      </w:r>
+      <w:r>
+        <w:rPr>
+          <w:sz w:val="32"/>
+          <w:szCs w:val="32"/>
+        </w:rPr>
+        <w:t>ent to Tycho in 1575</w:t>
+      </w:r>
+    </w:p>
+    <w:p>
+      <w:pPr>
+        <w:numPr>
+          <w:ilvl w:val="0"/>
+          <w:numId w:val="19"/>
+        </w:numPr>
+        <w:rPr>
+          <w:sz w:val="32"/>
+          <w:szCs w:val="32"/>
+        </w:rPr>
+      </w:pPr>
+      <w:r>
+        <w:rPr>
+          <w:sz w:val="32"/>
+          <w:szCs w:val="32"/>
+        </w:rPr>
+        <w:t>He filled the cracks and made it perfectly spherical with hundreds of pieces of parchment</w:t>
+      </w:r>
+    </w:p>
+    <w:p>
+      <w:pPr>
+        <w:numPr>
+          <w:ilvl w:val="0"/>
+          <w:numId w:val="19"/>
+        </w:numPr>
+        <w:rPr>
+          <w:sz w:val="32"/>
+          <w:szCs w:val="32"/>
+        </w:rPr>
+      </w:pPr>
+      <w:r>
+        <w:rPr>
+          <w:sz w:val="32"/>
+          <w:szCs w:val="32"/>
+        </w:rPr>
+        <w:t>Tycho then tested it for 2 years to whether it would change shape and withstand the temperature differences of the seasons</w:t>
+      </w:r>
+    </w:p>
+    <w:p>
+      <w:pPr>
+        <w:numPr>
+          <w:ilvl w:val="0"/>
+          <w:numId w:val="19"/>
+        </w:numPr>
+        <w:rPr>
+          <w:sz w:val="32"/>
+          <w:szCs w:val="32"/>
+        </w:rPr>
+      </w:pPr>
+      <w:r>
+        <w:rPr>
+          <w:sz w:val="32"/>
+          <w:szCs w:val="32"/>
+        </w:rPr>
+        <w:t>After this test did not affect the sphericity of the globe, Tycho covered it with brass plates and had it smoothed to ensure it remained perfectly spherical</w:t>
+      </w:r>
+    </w:p>
+    <w:p>
+      <w:pPr>
+        <w:numPr>
+          <w:ilvl w:val="0"/>
+          <w:numId w:val="19"/>
+        </w:numPr>
+        <w:rPr>
+          <w:sz w:val="32"/>
+          <w:szCs w:val="32"/>
+        </w:rPr>
+      </w:pPr>
+      <w:r>
+        <w:rPr>
+          <w:sz w:val="32"/>
+          <w:szCs w:val="32"/>
+        </w:rPr>
+        <w:t>The zodiac was then drawn upon the globe, the equator and the poles.</w:t>
+      </w:r>
+    </w:p>
+    <w:p>
+      <w:pPr>
+        <w:numPr>
+          <w:ilvl w:val="0"/>
+          <w:numId w:val="19"/>
+        </w:numPr>
+        <w:rPr>
+          <w:sz w:val="32"/>
+          <w:szCs w:val="32"/>
+        </w:rPr>
+      </w:pPr>
+      <w:r>
+        <w:rPr>
+          <w:sz w:val="32"/>
+          <w:szCs w:val="32"/>
+        </w:rPr>
+        <w:t>The positions of the stars were then entered on the globe until 1000 stars had been completed.</w:t>
+      </w:r>
+    </w:p>
+    <w:p>
+      <w:pPr>
+        <w:numPr>
+          <w:ilvl w:val="0"/>
+          <w:numId w:val="19"/>
+        </w:numPr>
+        <w:rPr>
+          <w:sz w:val="32"/>
+          <w:szCs w:val="32"/>
+        </w:rPr>
+      </w:pPr>
+      <w:r>
+        <w:rPr>
+          <w:sz w:val="32"/>
+          <w:szCs w:val="32"/>
+        </w:rPr>
+        <w:t>All of this took 25 years, but with so much the greater certainty, perfection and accuracy.</w:t>
+      </w:r>
+    </w:p>
+    <w:p>
+      <w:pPr>
+        <w:numPr>
+          <w:ilvl w:val="0"/>
+          <w:numId w:val="19"/>
+        </w:numPr>
+        <w:rPr>
+          <w:sz w:val="32"/>
+          <w:szCs w:val="32"/>
+        </w:rPr>
+      </w:pPr>
+      <w:r>
+        <w:rPr>
+          <w:i/>
+          <w:iCs/>
+          <w:sz w:val="32"/>
+          <w:szCs w:val="32"/>
+        </w:rPr>
+        <w:t>If it has been done well enough, it has been done quickly enough</w:t>
+      </w:r>
+    </w:p>
+    <w:p>
+      <w:pPr>
+        <w:numPr>
+          <w:ilvl w:val="0"/>
+          <w:numId w:val="19"/>
+        </w:numPr>
+        <w:rPr>
+          <w:sz w:val="32"/>
+          <w:szCs w:val="32"/>
+        </w:rPr>
+      </w:pPr>
+      <w:r>
+        <w:rPr>
+          <w:sz w:val="32"/>
+          <w:szCs w:val="32"/>
+        </w:rPr>
+        <w:t xml:space="preserve">Meanwhile the outer </w:t>
+      </w:r>
+      <w:proofErr w:type="spellStart"/>
+      <w:r>
+        <w:rPr>
+          <w:sz w:val="32"/>
+          <w:szCs w:val="32"/>
+        </w:rPr>
+        <w:t>armillae</w:t>
+      </w:r>
+      <w:proofErr w:type="spellEnd"/>
+      <w:r>
+        <w:rPr>
+          <w:sz w:val="32"/>
+          <w:szCs w:val="32"/>
+        </w:rPr>
+        <w:t xml:space="preserve"> had been mounted, i.e. the meridian and horizon, within which the whole globe is confined and turns about its axis through its poles.</w:t>
+      </w:r>
+    </w:p>
+    <w:p>
+      <w:pPr>
+        <w:numPr>
+          <w:ilvl w:val="0"/>
+          <w:numId w:val="19"/>
+        </w:numPr>
+        <w:rPr>
+          <w:sz w:val="32"/>
+          <w:szCs w:val="32"/>
+        </w:rPr>
+      </w:pPr>
+      <w:r>
+        <w:rPr>
+          <w:sz w:val="32"/>
+          <w:szCs w:val="32"/>
+        </w:rPr>
+        <w:t>The meridian is made of strong brass and is divided into arcminutes in order to indicate the azimuth</w:t>
+      </w:r>
+    </w:p>
+    <w:p>
+      <w:pPr>
+        <w:numPr>
+          <w:ilvl w:val="0"/>
+          <w:numId w:val="19"/>
+        </w:numPr>
+        <w:rPr>
+          <w:sz w:val="32"/>
+          <w:szCs w:val="32"/>
+        </w:rPr>
+      </w:pPr>
+      <w:r>
+        <w:rPr>
+          <w:sz w:val="32"/>
+          <w:szCs w:val="32"/>
+        </w:rPr>
+        <w:lastRenderedPageBreak/>
+        <w:t>every respect, has never I think been constructed up to now by any man anywhere in the world. (Slay I be forgiven if I boast).</w:t>
+      </w:r>
+    </w:p>
+    <w:p>
+      <w:pPr>
+        <w:numPr>
+          <w:ilvl w:val="0"/>
+          <w:numId w:val="19"/>
+        </w:numPr>
+        <w:rPr>
+          <w:sz w:val="32"/>
+          <w:szCs w:val="32"/>
+        </w:rPr>
+      </w:pPr>
+      <w:r>
+        <w:rPr>
+          <w:sz w:val="32"/>
+          <w:szCs w:val="32"/>
+        </w:rPr>
+        <w:t xml:space="preserve">It is a huge and splendid piece of work. </w:t>
+      </w:r>
+    </w:p>
+    <w:p>
+      <w:pPr>
+        <w:numPr>
+          <w:ilvl w:val="0"/>
+          <w:numId w:val="19"/>
+        </w:numPr>
+        <w:rPr>
+          <w:b/>
+          <w:bCs/>
+          <w:sz w:val="32"/>
+          <w:szCs w:val="32"/>
+        </w:rPr>
+      </w:pPr>
+      <w:r>
+        <w:rPr>
+          <w:sz w:val="32"/>
+          <w:szCs w:val="32"/>
+        </w:rPr>
+        <w:t>Many people from various countries travelled to Denmark in order to see this globe and my other instruments while the kingdom of Urania and the magnificent castle were still safe.</w:t>
+      </w:r>
+      <w:r>
+        <w:rPr>
+          <w:b/>
+          <w:bCs/>
+          <w:sz w:val="32"/>
+          <w:szCs w:val="32"/>
+        </w:rPr>
+        <w:t xml:space="preserve"> </w:t>
+      </w:r>
+    </w:p>
+    <w:p>
+      <w:pPr>
+        <w:rPr>
+          <w:b/>
+          <w:bCs/>
+          <w:sz w:val="32"/>
+          <w:szCs w:val="32"/>
+        </w:rPr>
+      </w:pPr>
+      <w:r>
+        <w:rPr>
+          <w:b/>
+          <w:bCs/>
+          <w:sz w:val="32"/>
+          <w:szCs w:val="32"/>
+        </w:rPr>
+        <w:br w:type="page"/>
+      </w:r>
+      <w:r>
+        <w:rPr>
+          <w:b/>
+          <w:bCs/>
+          <w:sz w:val="32"/>
+          <w:szCs w:val="32"/>
+        </w:rPr>
+        <w:lastRenderedPageBreak/>
+        <w:t>Post-Uraniborg</w:t>
+      </w:r>
+    </w:p>
+    <w:p>
+      <w:pPr>
+        <w:rPr>
+          <w:sz w:val="22"/>
+          <w:szCs w:val="22"/>
+        </w:rPr>
+      </w:pPr>
+      <w:r>
+        <w:rPr>
+          <w:sz w:val="22"/>
+          <w:szCs w:val="22"/>
+        </w:rPr>
+        <w:t>Why did he leave Uraniborg</w:t>
+      </w:r>
+    </w:p>
+    <w:p>
+      <w:pPr>
+        <w:rPr>
+          <w:sz w:val="22"/>
+          <w:szCs w:val="22"/>
+        </w:rPr>
+      </w:pPr>
+      <w:r>
+        <w:rPr>
+          <w:sz w:val="22"/>
+          <w:szCs w:val="22"/>
+        </w:rPr>
+        <w:t>Where did he go</w:t>
+      </w:r>
+    </w:p>
+    <w:p>
+      <w:pPr>
+        <w:rPr>
+          <w:sz w:val="22"/>
+          <w:szCs w:val="22"/>
+        </w:rPr>
+      </w:pPr>
+      <w:r>
+        <w:rPr>
+          <w:sz w:val="22"/>
+          <w:szCs w:val="22"/>
+        </w:rPr>
+        <w:t>Kepler:</w:t>
+      </w:r>
+    </w:p>
+    <w:p>
+      <w:pPr>
+        <w:pStyle w:val="ListParagraph"/>
+        <w:numPr>
+          <w:ilvl w:val="0"/>
+          <w:numId w:val="20"/>
+        </w:numPr>
+        <w:rPr>
+          <w:sz w:val="22"/>
+          <w:szCs w:val="22"/>
+        </w:rPr>
+      </w:pPr>
+      <w:r>
+        <w:rPr>
+          <w:sz w:val="22"/>
+          <w:szCs w:val="22"/>
+        </w:rPr>
+        <w:t>How was the meeting arranged?</w:t>
+      </w:r>
+    </w:p>
+    <w:p>
+      <w:pPr>
+        <w:pStyle w:val="ListParagraph"/>
+        <w:numPr>
+          <w:ilvl w:val="0"/>
+          <w:numId w:val="20"/>
+        </w:numPr>
+        <w:rPr>
+          <w:sz w:val="22"/>
+          <w:szCs w:val="22"/>
+        </w:rPr>
+      </w:pPr>
+      <w:r>
+        <w:rPr>
+          <w:sz w:val="22"/>
+          <w:szCs w:val="22"/>
+        </w:rPr>
+        <w:t xml:space="preserve">When did </w:t>
+      </w:r>
+      <w:r>
+        <w:rPr>
+          <w:sz w:val="22"/>
+          <w:szCs w:val="22"/>
+        </w:rPr>
+        <w:t>they</w:t>
+      </w:r>
+      <w:r>
+        <w:rPr>
+          <w:sz w:val="22"/>
+          <w:szCs w:val="22"/>
+        </w:rPr>
+        <w:t xml:space="preserve"> meet</w:t>
+      </w:r>
+      <w:r>
+        <w:rPr>
+          <w:sz w:val="22"/>
+          <w:szCs w:val="22"/>
+        </w:rPr>
+        <w:t>?</w:t>
+      </w:r>
+    </w:p>
+    <w:p>
+      <w:pPr>
+        <w:pStyle w:val="ListParagraph"/>
+        <w:numPr>
+          <w:ilvl w:val="0"/>
+          <w:numId w:val="20"/>
+        </w:numPr>
+        <w:rPr>
+          <w:sz w:val="22"/>
+          <w:szCs w:val="22"/>
+        </w:rPr>
+      </w:pPr>
+      <w:r>
+        <w:rPr>
+          <w:sz w:val="22"/>
+          <w:szCs w:val="22"/>
+        </w:rPr>
+        <w:t>What was their relationship like?</w:t>
+      </w:r>
+    </w:p>
+    <w:p>
+      <w:pPr>
+        <w:rPr>
+          <w:sz w:val="32"/>
+          <w:szCs w:val="32"/>
+        </w:rPr>
+      </w:pPr>
+      <w:r>
+        <w:rPr>
+          <w:sz w:val="32"/>
+          <w:szCs w:val="32"/>
+        </w:rPr>
+        <w:t>King Frederick dies in 1588</w:t>
+      </w:r>
+    </w:p>
+    <w:p>
+      <w:pPr>
+        <w:rPr>
+          <w:sz w:val="32"/>
+          <w:szCs w:val="32"/>
+        </w:rPr>
+      </w:pPr>
+      <w:r>
+        <w:rPr>
+          <w:sz w:val="32"/>
+          <w:szCs w:val="32"/>
+        </w:rPr>
+        <w:t>Chris</w:t>
+      </w:r>
+      <w:r>
+        <w:rPr>
+          <w:sz w:val="32"/>
+          <w:szCs w:val="32"/>
+        </w:rPr>
+        <w:t xml:space="preserve">tian IV was </w:t>
+      </w:r>
+      <w:r>
+        <w:rPr>
+          <w:sz w:val="32"/>
+          <w:szCs w:val="32"/>
+        </w:rPr>
+        <w:t xml:space="preserve">(just under) </w:t>
+      </w:r>
+      <w:r>
+        <w:rPr>
+          <w:sz w:val="32"/>
+          <w:szCs w:val="32"/>
+        </w:rPr>
+        <w:t>11 years old</w:t>
+      </w:r>
+    </w:p>
+    <w:p>
+      <w:pPr>
+        <w:pStyle w:val="ListParagraph"/>
+        <w:numPr>
+          <w:ilvl w:val="0"/>
+          <w:numId w:val="22"/>
+        </w:numPr>
+        <w:rPr>
+          <w:sz w:val="32"/>
+          <w:szCs w:val="32"/>
+        </w:rPr>
+      </w:pPr>
+      <w:r>
+        <w:rPr>
+          <w:sz w:val="32"/>
+          <w:szCs w:val="32"/>
+        </w:rPr>
+        <w:t xml:space="preserve">Regency council formed until </w:t>
+      </w:r>
+      <w:r>
+        <w:rPr>
+          <w:sz w:val="32"/>
+          <w:szCs w:val="32"/>
+        </w:rPr>
+        <w:t>C IV</w:t>
+      </w:r>
+      <w:r>
+        <w:rPr>
+          <w:sz w:val="32"/>
+          <w:szCs w:val="32"/>
+        </w:rPr>
+        <w:t xml:space="preserve"> came of age</w:t>
+      </w:r>
+    </w:p>
+    <w:p>
+      <w:pPr>
+        <w:pStyle w:val="ListParagraph"/>
+        <w:numPr>
+          <w:ilvl w:val="0"/>
+          <w:numId w:val="22"/>
+        </w:numPr>
+        <w:rPr>
+          <w:sz w:val="32"/>
+          <w:szCs w:val="32"/>
+        </w:rPr>
+      </w:pPr>
+      <w:r>
+        <w:rPr>
+          <w:sz w:val="32"/>
+          <w:szCs w:val="32"/>
+        </w:rPr>
+        <w:t>In Aug 1596 C IV became king</w:t>
+      </w:r>
+    </w:p>
+    <w:p>
+      <w:pPr>
+        <w:pStyle w:val="ListParagraph"/>
+        <w:numPr>
+          <w:ilvl w:val="0"/>
+          <w:numId w:val="22"/>
+        </w:numPr>
+        <w:rPr>
+          <w:sz w:val="32"/>
+          <w:szCs w:val="32"/>
+        </w:rPr>
+      </w:pPr>
+      <w:r>
+        <w:rPr>
+          <w:sz w:val="32"/>
+          <w:szCs w:val="32"/>
+        </w:rPr>
+        <w:t>Aimed to form a unity of state and church under the crown</w:t>
+      </w:r>
+    </w:p>
+    <w:p>
+      <w:pPr>
+        <w:pStyle w:val="ListParagraph"/>
+        <w:numPr>
+          <w:ilvl w:val="0"/>
+          <w:numId w:val="22"/>
+        </w:numPr>
+        <w:rPr>
+          <w:sz w:val="32"/>
+          <w:szCs w:val="32"/>
+        </w:rPr>
+      </w:pPr>
+      <w:r>
+        <w:rPr>
+          <w:sz w:val="32"/>
+          <w:szCs w:val="32"/>
+        </w:rPr>
+        <w:t>Various nobleman on the Council had their powers removed, losing castles and abbeys</w:t>
+      </w:r>
+    </w:p>
+    <w:p>
+      <w:pPr>
+        <w:rPr>
+          <w:sz w:val="32"/>
+          <w:szCs w:val="32"/>
+        </w:rPr>
+      </w:pPr>
+      <w:r>
+        <w:rPr>
+          <w:sz w:val="32"/>
+          <w:szCs w:val="32"/>
+        </w:rPr>
+        <w:t>Professors at University of Copenhagen felt that Uraniborg was draining the university of students</w:t>
+      </w:r>
+      <w:r>
+        <w:rPr>
+          <w:sz w:val="32"/>
+          <w:szCs w:val="32"/>
+        </w:rPr>
+        <w:t xml:space="preserve"> and financial support</w:t>
+      </w:r>
+    </w:p>
+    <w:p>
+      <w:pPr>
+        <w:rPr>
+          <w:sz w:val="32"/>
+          <w:szCs w:val="32"/>
+        </w:rPr>
+      </w:pPr>
+      <w:r>
+        <w:rPr>
+          <w:sz w:val="32"/>
+          <w:szCs w:val="32"/>
+        </w:rPr>
+        <w:t>29</w:t>
+      </w:r>
+      <w:r>
+        <w:rPr>
+          <w:sz w:val="32"/>
+          <w:szCs w:val="32"/>
+          <w:vertAlign w:val="superscript"/>
+        </w:rPr>
+        <w:t>th</w:t>
+      </w:r>
+      <w:r>
+        <w:rPr>
+          <w:sz w:val="32"/>
+          <w:szCs w:val="32"/>
+        </w:rPr>
+        <w:t xml:space="preserve"> Mar 1597: </w:t>
+      </w:r>
+      <w:r>
+        <w:rPr>
+          <w:sz w:val="32"/>
+          <w:szCs w:val="32"/>
+        </w:rPr>
+        <w:t>Tycho leaves Uraniborg</w:t>
+      </w:r>
+    </w:p>
+    <w:p>
+      <w:pPr>
+        <w:rPr>
+          <w:sz w:val="32"/>
+          <w:szCs w:val="32"/>
+        </w:rPr>
+      </w:pPr>
+      <w:r>
+        <w:rPr>
+          <w:sz w:val="32"/>
+          <w:szCs w:val="32"/>
+        </w:rPr>
+        <w:t>11</w:t>
+      </w:r>
+      <w:r>
+        <w:rPr>
+          <w:sz w:val="32"/>
+          <w:szCs w:val="32"/>
+          <w:vertAlign w:val="superscript"/>
+        </w:rPr>
+        <w:t>th</w:t>
+      </w:r>
+      <w:r>
+        <w:rPr>
+          <w:sz w:val="32"/>
+          <w:szCs w:val="32"/>
+        </w:rPr>
+        <w:t xml:space="preserve"> Ap</w:t>
+      </w:r>
+      <w:r>
+        <w:rPr>
+          <w:sz w:val="32"/>
+          <w:szCs w:val="32"/>
+        </w:rPr>
+        <w:t>r</w:t>
+      </w:r>
+      <w:r>
+        <w:rPr>
+          <w:sz w:val="32"/>
+          <w:szCs w:val="32"/>
+        </w:rPr>
+        <w:t xml:space="preserve"> 1597: </w:t>
+      </w:r>
+      <w:r>
+        <w:rPr>
+          <w:sz w:val="32"/>
+          <w:szCs w:val="32"/>
+        </w:rPr>
+        <w:t xml:space="preserve">Moves </w:t>
+      </w:r>
+      <w:r>
+        <w:rPr>
+          <w:sz w:val="32"/>
+          <w:szCs w:val="32"/>
+        </w:rPr>
+        <w:t xml:space="preserve">into </w:t>
+      </w:r>
+      <w:r>
+        <w:rPr>
+          <w:sz w:val="32"/>
+          <w:szCs w:val="32"/>
+        </w:rPr>
+        <w:t xml:space="preserve">his mansion in </w:t>
+      </w:r>
+      <w:r>
+        <w:rPr>
+          <w:sz w:val="32"/>
+          <w:szCs w:val="32"/>
+        </w:rPr>
+        <w:t>Copenhagen</w:t>
+      </w:r>
+    </w:p>
+    <w:p>
+      <w:pPr>
+        <w:pStyle w:val="ListParagraph"/>
+        <w:numPr>
+          <w:ilvl w:val="0"/>
+          <w:numId w:val="23"/>
+        </w:numPr>
+        <w:rPr>
+          <w:sz w:val="32"/>
+          <w:szCs w:val="32"/>
+        </w:rPr>
+      </w:pPr>
+      <w:r>
+        <w:rPr>
+          <w:sz w:val="32"/>
+          <w:szCs w:val="32"/>
+        </w:rPr>
+        <w:t>Never returns to Uraniborg</w:t>
+      </w:r>
+    </w:p>
+    <w:p>
+      <w:pPr>
+        <w:pStyle w:val="ListParagraph"/>
+        <w:numPr>
+          <w:ilvl w:val="0"/>
+          <w:numId w:val="23"/>
+        </w:numPr>
+        <w:rPr>
+          <w:sz w:val="32"/>
+          <w:szCs w:val="32"/>
+        </w:rPr>
+      </w:pPr>
+      <w:r>
+        <w:rPr>
+          <w:sz w:val="32"/>
+          <w:szCs w:val="32"/>
+        </w:rPr>
+        <w:t xml:space="preserve">King forbids Tycho from </w:t>
+      </w:r>
+      <w:r>
+        <w:rPr>
+          <w:sz w:val="32"/>
+          <w:szCs w:val="32"/>
+        </w:rPr>
+        <w:t>using city walls as an observatory</w:t>
+      </w:r>
+    </w:p>
+    <w:p>
+      <w:pPr>
+        <w:rPr>
+          <w:sz w:val="32"/>
+          <w:szCs w:val="32"/>
+        </w:rPr>
+      </w:pPr>
+      <w:r>
+        <w:rPr>
+          <w:sz w:val="32"/>
+          <w:szCs w:val="32"/>
+        </w:rPr>
+        <w:t>2</w:t>
+      </w:r>
+      <w:r>
+        <w:rPr>
+          <w:sz w:val="32"/>
+          <w:szCs w:val="32"/>
+          <w:vertAlign w:val="superscript"/>
+        </w:rPr>
+        <w:t>nd</w:t>
+      </w:r>
+      <w:r>
+        <w:rPr>
+          <w:sz w:val="32"/>
+          <w:szCs w:val="32"/>
+        </w:rPr>
+        <w:t xml:space="preserve"> Jun </w:t>
+      </w:r>
+      <w:r>
+        <w:rPr>
+          <w:sz w:val="32"/>
+          <w:szCs w:val="32"/>
+        </w:rPr>
+        <w:t>– 8</w:t>
+      </w:r>
+      <w:r>
+        <w:rPr>
+          <w:sz w:val="32"/>
+          <w:szCs w:val="32"/>
+          <w:vertAlign w:val="superscript"/>
+        </w:rPr>
+        <w:t>th</w:t>
+      </w:r>
+      <w:r>
+        <w:rPr>
+          <w:sz w:val="32"/>
+          <w:szCs w:val="32"/>
+        </w:rPr>
+        <w:t xml:space="preserve"> Sept </w:t>
+      </w:r>
+      <w:r>
+        <w:rPr>
+          <w:sz w:val="32"/>
+          <w:szCs w:val="32"/>
+        </w:rPr>
+        <w:t xml:space="preserve">1597: </w:t>
+      </w:r>
+      <w:r>
+        <w:rPr>
+          <w:sz w:val="32"/>
+          <w:szCs w:val="32"/>
+        </w:rPr>
+        <w:t>Leaves</w:t>
+      </w:r>
+      <w:r>
+        <w:rPr>
+          <w:sz w:val="32"/>
+          <w:szCs w:val="32"/>
+        </w:rPr>
+        <w:t xml:space="preserve"> Copenhagen </w:t>
+      </w:r>
+      <w:r>
+        <w:rPr>
+          <w:sz w:val="32"/>
+          <w:szCs w:val="32"/>
+        </w:rPr>
+        <w:t>and lives in</w:t>
+      </w:r>
+      <w:r>
+        <w:rPr>
+          <w:sz w:val="32"/>
+          <w:szCs w:val="32"/>
+        </w:rPr>
+        <w:t xml:space="preserve"> Rostock</w:t>
+      </w:r>
+    </w:p>
+    <w:p>
+      <w:pPr>
+        <w:rPr>
+          <w:sz w:val="32"/>
+          <w:szCs w:val="32"/>
+        </w:rPr>
+      </w:pPr>
+      <w:r>
+        <w:rPr>
+          <w:sz w:val="32"/>
+          <w:szCs w:val="32"/>
+        </w:rPr>
+        <w:t>L</w:t>
+      </w:r>
+      <w:r>
+        <w:rPr>
+          <w:sz w:val="32"/>
+          <w:szCs w:val="32"/>
+        </w:rPr>
+        <w:t>ate</w:t>
+      </w:r>
+      <w:r>
+        <w:rPr>
+          <w:sz w:val="32"/>
+          <w:szCs w:val="32"/>
+        </w:rPr>
+        <w:t xml:space="preserve"> Sep </w:t>
+      </w:r>
+      <w:r>
+        <w:rPr>
+          <w:sz w:val="32"/>
+          <w:szCs w:val="32"/>
+        </w:rPr>
+        <w:t>1</w:t>
+      </w:r>
+      <w:r>
+        <w:rPr>
+          <w:sz w:val="32"/>
+          <w:szCs w:val="32"/>
+        </w:rPr>
+        <w:t xml:space="preserve">597: </w:t>
+      </w:r>
+      <w:r>
+        <w:rPr>
+          <w:sz w:val="32"/>
+          <w:szCs w:val="32"/>
+        </w:rPr>
+        <w:t xml:space="preserve">Arrives at </w:t>
+      </w:r>
+      <w:proofErr w:type="spellStart"/>
+      <w:r>
+        <w:rPr>
+          <w:sz w:val="32"/>
+          <w:szCs w:val="32"/>
+        </w:rPr>
+        <w:t>Wan</w:t>
+      </w:r>
+      <w:r>
+        <w:rPr>
+          <w:sz w:val="32"/>
+          <w:szCs w:val="32"/>
+        </w:rPr>
+        <w:t>d</w:t>
+      </w:r>
+      <w:r>
+        <w:rPr>
+          <w:sz w:val="32"/>
+          <w:szCs w:val="32"/>
+        </w:rPr>
+        <w:t>sburg</w:t>
+      </w:r>
+      <w:proofErr w:type="spellEnd"/>
+      <w:r>
+        <w:rPr>
+          <w:sz w:val="32"/>
+          <w:szCs w:val="32"/>
+        </w:rPr>
+        <w:t xml:space="preserve"> Castle</w:t>
+      </w:r>
+      <w:r>
+        <w:rPr>
+          <w:sz w:val="32"/>
+          <w:szCs w:val="32"/>
+        </w:rPr>
+        <w:t xml:space="preserve"> (Heinrich Rantzau)</w:t>
+      </w:r>
+    </w:p>
+    <w:p>
+      <w:pPr>
+        <w:pStyle w:val="ListParagraph"/>
+        <w:numPr>
+          <w:ilvl w:val="0"/>
+          <w:numId w:val="24"/>
+        </w:numPr>
+        <w:rPr>
+          <w:sz w:val="32"/>
+          <w:szCs w:val="32"/>
+        </w:rPr>
+      </w:pPr>
+      <w:r>
+        <w:rPr>
+          <w:sz w:val="32"/>
+          <w:szCs w:val="32"/>
+        </w:rPr>
+        <w:t>Writes his Elegy to Urania: ‘Denmark what is my offence?’</w:t>
+      </w:r>
+      <w:r>
+        <w:rPr>
+          <w:sz w:val="32"/>
+          <w:szCs w:val="32"/>
+        </w:rPr>
+        <w:t xml:space="preserve"> (OTI p216)</w:t>
+      </w:r>
+    </w:p>
+    <w:p>
+      <w:pPr>
+        <w:pStyle w:val="ListParagraph"/>
+        <w:numPr>
+          <w:ilvl w:val="0"/>
+          <w:numId w:val="24"/>
+        </w:numPr>
+        <w:rPr>
+          <w:sz w:val="32"/>
+          <w:szCs w:val="32"/>
+        </w:rPr>
+      </w:pPr>
+      <w:r>
+        <w:rPr>
+          <w:sz w:val="32"/>
+          <w:szCs w:val="32"/>
+        </w:rPr>
+        <w:t>Receives letter from Kepler and book from Ursus</w:t>
+      </w:r>
+    </w:p>
+    <w:p>
+      <w:pPr>
+        <w:pStyle w:val="ListParagraph"/>
+        <w:numPr>
+          <w:ilvl w:val="0"/>
+          <w:numId w:val="24"/>
+        </w:numPr>
+        <w:rPr>
+          <w:sz w:val="32"/>
+          <w:szCs w:val="32"/>
+        </w:rPr>
+      </w:pPr>
+      <w:r>
+        <w:rPr>
+          <w:sz w:val="32"/>
+          <w:szCs w:val="32"/>
+        </w:rPr>
+        <w:t>Rudolph</w:t>
+      </w:r>
+      <w:r>
+        <w:rPr>
+          <w:sz w:val="32"/>
+          <w:szCs w:val="32"/>
+        </w:rPr>
+        <w:t xml:space="preserve"> II becomes aware of T and wishes to see him</w:t>
+      </w:r>
+    </w:p>
+    <w:p>
+      <w:pPr>
+        <w:rPr>
+          <w:sz w:val="32"/>
+          <w:szCs w:val="32"/>
+        </w:rPr>
+      </w:pPr>
+      <w:r>
+        <w:rPr>
+          <w:sz w:val="32"/>
+          <w:szCs w:val="32"/>
+        </w:rPr>
+        <w:t>29</w:t>
+      </w:r>
+      <w:r>
+        <w:rPr>
+          <w:sz w:val="32"/>
+          <w:szCs w:val="32"/>
+          <w:vertAlign w:val="superscript"/>
+        </w:rPr>
+        <w:t>th</w:t>
+      </w:r>
+      <w:r>
+        <w:rPr>
+          <w:sz w:val="32"/>
+          <w:szCs w:val="32"/>
+        </w:rPr>
+        <w:t xml:space="preserve"> Sep 1598: Leaves </w:t>
+      </w:r>
+      <w:proofErr w:type="spellStart"/>
+      <w:r>
+        <w:rPr>
+          <w:sz w:val="32"/>
+          <w:szCs w:val="32"/>
+        </w:rPr>
+        <w:t>Wandsburg</w:t>
+      </w:r>
+      <w:proofErr w:type="spellEnd"/>
+      <w:r>
+        <w:rPr>
+          <w:sz w:val="32"/>
+          <w:szCs w:val="32"/>
+        </w:rPr>
+        <w:t xml:space="preserve"> Castle </w:t>
+      </w:r>
+    </w:p>
+    <w:p>
+      <w:pPr>
+        <w:rPr>
+          <w:sz w:val="32"/>
+          <w:szCs w:val="32"/>
+        </w:rPr>
+      </w:pPr>
+      <w:r>
+        <w:rPr>
+          <w:sz w:val="32"/>
+          <w:szCs w:val="32"/>
+        </w:rPr>
+        <w:lastRenderedPageBreak/>
+        <w:t xml:space="preserve">Wagons and horses of a great noble household rumbled out of </w:t>
+      </w:r>
+      <w:proofErr w:type="spellStart"/>
+      <w:r>
+        <w:rPr>
+          <w:sz w:val="32"/>
+          <w:szCs w:val="32"/>
+        </w:rPr>
+        <w:t>Wandsburg</w:t>
+      </w:r>
+      <w:proofErr w:type="spellEnd"/>
+      <w:r>
+        <w:rPr>
+          <w:sz w:val="32"/>
+          <w:szCs w:val="32"/>
+        </w:rPr>
+        <w:t>: 3 splendid carriages led the train including Tycho’s own personal carriage led by 3 horses</w:t>
+      </w:r>
+      <w:r>
+        <w:rPr>
+          <w:sz w:val="32"/>
+          <w:szCs w:val="32"/>
+        </w:rPr>
+        <w:t xml:space="preserve"> (OTI, p227)</w:t>
+      </w:r>
+    </w:p>
+    <w:p>
+      <w:pPr>
+        <w:rPr>
+          <w:sz w:val="32"/>
+          <w:szCs w:val="32"/>
+        </w:rPr>
+      </w:pPr>
+      <w:r>
+        <w:rPr>
+          <w:sz w:val="32"/>
+          <w:szCs w:val="32"/>
+        </w:rPr>
+        <w:t>Stays Winter in Wittenb</w:t>
+      </w:r>
+      <w:r>
+        <w:rPr>
+          <w:sz w:val="32"/>
+          <w:szCs w:val="32"/>
+        </w:rPr>
+        <w:t>e</w:t>
+      </w:r>
+      <w:r>
+        <w:rPr>
+          <w:sz w:val="32"/>
+          <w:szCs w:val="32"/>
+        </w:rPr>
+        <w:t>rg due to Plague in Bohemia</w:t>
+      </w:r>
+    </w:p>
+    <w:p>
+      <w:pPr>
+        <w:pStyle w:val="ListParagraph"/>
+        <w:numPr>
+          <w:ilvl w:val="0"/>
+          <w:numId w:val="24"/>
+        </w:numPr>
+        <w:rPr>
+          <w:sz w:val="32"/>
+          <w:szCs w:val="32"/>
+        </w:rPr>
+      </w:pPr>
+      <w:r>
+        <w:rPr>
+          <w:sz w:val="32"/>
+          <w:szCs w:val="32"/>
+        </w:rPr>
+        <w:t>Writes Introduction to the Instauration of Astronomy</w:t>
+      </w:r>
+    </w:p>
+    <w:p>
+      <w:pPr>
+        <w:rPr>
+          <w:sz w:val="32"/>
+          <w:szCs w:val="32"/>
+        </w:rPr>
+      </w:pPr>
+      <w:r>
+        <w:rPr>
+          <w:sz w:val="32"/>
+          <w:szCs w:val="32"/>
+        </w:rPr>
+        <w:t>14</w:t>
+      </w:r>
+      <w:r>
+        <w:rPr>
+          <w:sz w:val="32"/>
+          <w:szCs w:val="32"/>
+        </w:rPr>
+        <w:t xml:space="preserve"> </w:t>
+      </w:r>
+      <w:r>
+        <w:rPr>
+          <w:sz w:val="32"/>
+          <w:szCs w:val="32"/>
+        </w:rPr>
+        <w:t>Jun 1599: Leaves Wittenb</w:t>
+      </w:r>
+      <w:r>
+        <w:rPr>
+          <w:sz w:val="32"/>
+          <w:szCs w:val="32"/>
+        </w:rPr>
+        <w:t>e</w:t>
+      </w:r>
+      <w:r>
+        <w:rPr>
+          <w:sz w:val="32"/>
+          <w:szCs w:val="32"/>
+        </w:rPr>
+        <w:t>rg</w:t>
+      </w:r>
+      <w:r>
+        <w:rPr>
+          <w:sz w:val="32"/>
+          <w:szCs w:val="32"/>
+        </w:rPr>
+        <w:t xml:space="preserve"> (OT</w:t>
+      </w:r>
+      <w:r>
+        <w:rPr>
+          <w:sz w:val="32"/>
+          <w:szCs w:val="32"/>
+        </w:rPr>
+        <w:t>I</w:t>
+      </w:r>
+      <w:r>
+        <w:rPr>
+          <w:sz w:val="32"/>
+          <w:szCs w:val="32"/>
+        </w:rPr>
+        <w:t>, p232)</w:t>
+      </w:r>
+    </w:p>
+    <w:p>
+      <w:pPr>
+        <w:rPr>
+          <w:sz w:val="32"/>
+          <w:szCs w:val="32"/>
+        </w:rPr>
+      </w:pPr>
+      <w:r>
+        <w:rPr>
+          <w:sz w:val="32"/>
+          <w:szCs w:val="32"/>
+        </w:rPr>
+        <w:t>Jun 1599 a</w:t>
+      </w:r>
+      <w:r>
+        <w:rPr>
+          <w:sz w:val="32"/>
+          <w:szCs w:val="32"/>
+        </w:rPr>
+        <w:t>rrives in Prague</w:t>
+      </w:r>
+      <w:r>
+        <w:rPr>
+          <w:sz w:val="32"/>
+          <w:szCs w:val="32"/>
+        </w:rPr>
+        <w:t xml:space="preserve"> (via Castle </w:t>
+      </w:r>
+      <w:proofErr w:type="spellStart"/>
+      <w:r>
+        <w:rPr>
+          <w:sz w:val="32"/>
+          <w:szCs w:val="32"/>
+        </w:rPr>
+        <w:t>Prezsch</w:t>
+      </w:r>
+      <w:proofErr w:type="spellEnd"/>
+      <w:r>
+        <w:rPr>
+          <w:sz w:val="32"/>
+          <w:szCs w:val="32"/>
+        </w:rPr>
+        <w:t xml:space="preserve"> and Dresden)</w:t>
+      </w:r>
+      <w:r>
+        <w:rPr>
+          <w:sz w:val="32"/>
+          <w:szCs w:val="32"/>
+        </w:rPr>
+        <w:t>:</w:t>
+      </w:r>
+    </w:p>
+    <w:p>
+      <w:pPr>
+        <w:pStyle w:val="ListParagraph"/>
+        <w:numPr>
+          <w:ilvl w:val="0"/>
+          <w:numId w:val="24"/>
+        </w:numPr>
+        <w:rPr>
+          <w:sz w:val="32"/>
+          <w:szCs w:val="32"/>
+        </w:rPr>
+      </w:pPr>
+      <w:r>
+        <w:rPr>
+          <w:sz w:val="32"/>
+          <w:szCs w:val="32"/>
+        </w:rPr>
+        <w:t>Meets Rudolph II and presents him with:</w:t>
+      </w:r>
+    </w:p>
+    <w:p>
+      <w:pPr>
+        <w:pStyle w:val="ListParagraph"/>
+        <w:numPr>
+          <w:ilvl w:val="1"/>
+          <w:numId w:val="24"/>
+        </w:numPr>
+        <w:rPr>
+          <w:sz w:val="32"/>
+          <w:szCs w:val="32"/>
+        </w:rPr>
+      </w:pPr>
+      <w:r>
+        <w:rPr>
+          <w:sz w:val="32"/>
+          <w:szCs w:val="32"/>
+        </w:rPr>
+        <w:t>Manuscript star catalogue</w:t>
+      </w:r>
+    </w:p>
+    <w:p>
+      <w:pPr>
+        <w:pStyle w:val="ListParagraph"/>
+        <w:numPr>
+          <w:ilvl w:val="1"/>
+          <w:numId w:val="24"/>
+        </w:numPr>
+        <w:rPr>
+          <w:sz w:val="32"/>
+          <w:szCs w:val="32"/>
+        </w:rPr>
+      </w:pPr>
+      <w:r>
+        <w:rPr>
+          <w:sz w:val="32"/>
+          <w:szCs w:val="32"/>
+        </w:rPr>
+        <w:t>Ephemerides of the Sun and Moon prepared in Wittenberg</w:t>
+      </w:r>
+    </w:p>
+    <w:p>
+      <w:pPr>
+        <w:pStyle w:val="ListParagraph"/>
+        <w:numPr>
+          <w:ilvl w:val="1"/>
+          <w:numId w:val="24"/>
+        </w:numPr>
+        <w:rPr>
+          <w:sz w:val="32"/>
+          <w:szCs w:val="32"/>
+        </w:rPr>
+      </w:pPr>
+      <w:r>
+        <w:rPr>
+          <w:sz w:val="32"/>
+          <w:szCs w:val="32"/>
+        </w:rPr>
+        <w:t xml:space="preserve">His </w:t>
+      </w:r>
+      <w:proofErr w:type="spellStart"/>
+      <w:r>
+        <w:rPr>
+          <w:i/>
+          <w:iCs/>
+          <w:sz w:val="32"/>
+          <w:szCs w:val="32"/>
+        </w:rPr>
+        <w:t>Astronomiae</w:t>
+      </w:r>
+      <w:proofErr w:type="spellEnd"/>
+      <w:r>
+        <w:rPr>
+          <w:i/>
+          <w:iCs/>
+          <w:sz w:val="32"/>
+          <w:szCs w:val="32"/>
+        </w:rPr>
+        <w:t xml:space="preserve"> </w:t>
+      </w:r>
+      <w:proofErr w:type="spellStart"/>
+      <w:r>
+        <w:rPr>
+          <w:i/>
+          <w:iCs/>
+          <w:sz w:val="32"/>
+          <w:szCs w:val="32"/>
+        </w:rPr>
+        <w:t>instauratae</w:t>
+      </w:r>
+      <w:proofErr w:type="spellEnd"/>
+      <w:r>
+        <w:rPr>
+          <w:i/>
+          <w:iCs/>
+          <w:sz w:val="32"/>
+          <w:szCs w:val="32"/>
+        </w:rPr>
+        <w:t xml:space="preserve"> </w:t>
+      </w:r>
+      <w:proofErr w:type="spellStart"/>
+      <w:r>
+        <w:rPr>
+          <w:i/>
+          <w:iCs/>
+          <w:sz w:val="32"/>
+          <w:szCs w:val="32"/>
+        </w:rPr>
+        <w:t>mechanica</w:t>
+      </w:r>
+      <w:proofErr w:type="spellEnd"/>
+    </w:p>
+    <w:p>
+      <w:pPr>
+        <w:pStyle w:val="ListParagraph"/>
+        <w:numPr>
+          <w:ilvl w:val="0"/>
+          <w:numId w:val="24"/>
+        </w:numPr>
+        <w:rPr>
+          <w:sz w:val="32"/>
+          <w:szCs w:val="32"/>
+        </w:rPr>
+      </w:pPr>
+      <w:r>
+        <w:rPr>
+          <w:sz w:val="32"/>
+          <w:szCs w:val="32"/>
+        </w:rPr>
+        <w:t>Rudolph II</w:t>
+      </w:r>
+      <w:r>
+        <w:rPr>
+          <w:sz w:val="32"/>
+          <w:szCs w:val="32"/>
+        </w:rPr>
+        <w:t xml:space="preserve"> offered Tycho:</w:t>
+      </w:r>
+    </w:p>
+    <w:p>
+      <w:pPr>
+        <w:pStyle w:val="ListParagraph"/>
+        <w:numPr>
+          <w:ilvl w:val="1"/>
+          <w:numId w:val="24"/>
+        </w:numPr>
+        <w:rPr>
+          <w:sz w:val="32"/>
+          <w:szCs w:val="32"/>
+        </w:rPr>
+      </w:pPr>
+      <w:r>
+        <w:rPr>
+          <w:sz w:val="32"/>
+          <w:szCs w:val="32"/>
+        </w:rPr>
+        <w:t>Nominate his entire family for enrolment into the Bohemian nobility</w:t>
+      </w:r>
+    </w:p>
+    <w:p>
+      <w:pPr>
+        <w:pStyle w:val="ListParagraph"/>
+        <w:numPr>
+          <w:ilvl w:val="1"/>
+          <w:numId w:val="24"/>
+        </w:numPr>
+        <w:rPr>
+          <w:sz w:val="32"/>
+          <w:szCs w:val="32"/>
+        </w:rPr>
+      </w:pPr>
+      <w:r>
+        <w:rPr>
+          <w:sz w:val="32"/>
+          <w:szCs w:val="32"/>
+        </w:rPr>
+        <w:t xml:space="preserve">Choice of castles and hunting lodges – Tycho chose </w:t>
+      </w:r>
+      <w:proofErr w:type="spellStart"/>
+      <w:r>
+        <w:rPr>
+          <w:sz w:val="32"/>
+          <w:szCs w:val="32"/>
+        </w:rPr>
+        <w:t>Benatky</w:t>
+      </w:r>
+      <w:proofErr w:type="spellEnd"/>
+      <w:r>
+        <w:rPr>
+          <w:sz w:val="32"/>
+          <w:szCs w:val="32"/>
+        </w:rPr>
+        <w:t xml:space="preserve"> Castle</w:t>
+      </w:r>
+    </w:p>
+    <w:p>
+      <w:pPr>
+        <w:rPr>
+          <w:sz w:val="32"/>
+          <w:szCs w:val="32"/>
+        </w:rPr>
+      </w:pPr>
+    </w:p>
+    <w:p>
+      <w:pPr>
+        <w:rPr>
+          <w:sz w:val="32"/>
+          <w:szCs w:val="32"/>
+        </w:rPr>
+      </w:pPr>
+      <w:r>
+        <w:rPr>
+          <w:sz w:val="32"/>
+          <w:szCs w:val="32"/>
+        </w:rPr>
+        <w:t xml:space="preserve">Aug 1599: Tycho arrives at </w:t>
+      </w:r>
+      <w:proofErr w:type="spellStart"/>
+      <w:r>
+        <w:rPr>
+          <w:sz w:val="32"/>
+          <w:szCs w:val="32"/>
+        </w:rPr>
+        <w:t>Benatky</w:t>
+      </w:r>
+      <w:proofErr w:type="spellEnd"/>
+      <w:r>
+        <w:rPr>
+          <w:sz w:val="32"/>
+          <w:szCs w:val="32"/>
+        </w:rPr>
+        <w:t xml:space="preserve"> Castle with his family, sets up instruments from Stjerneborg and Magdeburg, as well as his library and other baggage from the latter.</w:t>
+      </w:r>
+    </w:p>
+    <w:p>
+      <w:pPr>
+        <w:pStyle w:val="ListParagraph"/>
+        <w:numPr>
+          <w:ilvl w:val="0"/>
+          <w:numId w:val="26"/>
+        </w:numPr>
+        <w:rPr>
+          <w:sz w:val="32"/>
+          <w:szCs w:val="32"/>
+        </w:rPr>
+      </w:pPr>
+      <w:r>
+        <w:rPr>
+          <w:sz w:val="32"/>
+          <w:szCs w:val="32"/>
+        </w:rPr>
+        <w:t>Observatory described as a long</w:t>
+      </w:r>
+      <w:r>
+        <w:rPr>
+          <w:sz w:val="32"/>
+          <w:szCs w:val="32"/>
+        </w:rPr>
+        <w:t xml:space="preserve"> gallery with </w:t>
+      </w:r>
+      <w:r>
+        <w:rPr>
+          <w:sz w:val="32"/>
+          <w:szCs w:val="32"/>
+        </w:rPr>
+        <w:t xml:space="preserve">a dozen instruments, each in its own room, possibly with roofs that swung open like those of </w:t>
+      </w:r>
+      <w:r>
+        <w:rPr>
+          <w:sz w:val="32"/>
+          <w:szCs w:val="32"/>
+        </w:rPr>
+        <w:t>Stjerneborg</w:t>
+      </w:r>
+    </w:p>
+    <w:p>
+      <w:pPr>
+        <w:pStyle w:val="ListParagraph"/>
+        <w:numPr>
+          <w:ilvl w:val="0"/>
+          <w:numId w:val="26"/>
+        </w:numPr>
+        <w:rPr>
+          <w:sz w:val="32"/>
+          <w:szCs w:val="32"/>
+        </w:rPr>
+      </w:pPr>
+      <w:r>
+        <w:rPr>
+          <w:sz w:val="32"/>
+          <w:szCs w:val="32"/>
+        </w:rPr>
+        <w:t xml:space="preserve">Tycho learns that Kepler is in Prague and </w:t>
+      </w:r>
+      <w:proofErr w:type="spellStart"/>
+      <w:r>
+        <w:rPr>
+          <w:sz w:val="32"/>
+          <w:szCs w:val="32"/>
+        </w:rPr>
+        <w:t>summonds</w:t>
+      </w:r>
+      <w:proofErr w:type="spellEnd"/>
+      <w:r>
+        <w:rPr>
+          <w:sz w:val="32"/>
+          <w:szCs w:val="32"/>
+        </w:rPr>
+        <w:t xml:space="preserve"> him to </w:t>
+      </w:r>
+      <w:proofErr w:type="spellStart"/>
+      <w:r>
+        <w:rPr>
+          <w:sz w:val="32"/>
+          <w:szCs w:val="32"/>
+        </w:rPr>
+        <w:t>Benatky</w:t>
+      </w:r>
+      <w:proofErr w:type="spellEnd"/>
+      <w:r>
+        <w:rPr>
+          <w:sz w:val="32"/>
+          <w:szCs w:val="32"/>
+        </w:rPr>
+        <w:t xml:space="preserve"> on 4</w:t>
+      </w:r>
+      <w:r>
+        <w:rPr>
+          <w:sz w:val="32"/>
+          <w:szCs w:val="32"/>
+          <w:vertAlign w:val="superscript"/>
+        </w:rPr>
+        <w:t>th</w:t>
+      </w:r>
+      <w:r>
+        <w:rPr>
+          <w:sz w:val="32"/>
+          <w:szCs w:val="32"/>
+        </w:rPr>
+        <w:t xml:space="preserve"> Feb 1600</w:t>
+      </w:r>
+    </w:p>
+    <w:p>
+      <w:pPr>
+        <w:pStyle w:val="ListParagraph"/>
+        <w:numPr>
+          <w:ilvl w:val="0"/>
+          <w:numId w:val="26"/>
+        </w:numPr>
+        <w:rPr>
+          <w:sz w:val="32"/>
+          <w:szCs w:val="32"/>
+        </w:rPr>
+      </w:pPr>
+      <w:r>
+        <w:rPr>
+          <w:sz w:val="32"/>
+          <w:szCs w:val="32"/>
+        </w:rPr>
+        <w:t>Tycho and hi assistants being to observer with the equatorial armillary, a couple of sextants and two azimuthal quadrants</w:t>
+      </w:r>
+    </w:p>
+    <w:p>
+      <w:pPr>
+        <w:rPr>
+          <w:sz w:val="32"/>
+          <w:szCs w:val="32"/>
+        </w:rPr>
+      </w:pPr>
+      <w:r>
+        <w:rPr>
+          <w:sz w:val="32"/>
+          <w:szCs w:val="32"/>
+        </w:rPr>
+        <w:lastRenderedPageBreak/>
+        <w:t>Kepler:</w:t>
+      </w:r>
+    </w:p>
+    <w:p>
+      <w:pPr>
+        <w:pStyle w:val="ListParagraph"/>
+        <w:numPr>
+          <w:ilvl w:val="0"/>
+          <w:numId w:val="27"/>
+        </w:numPr>
+        <w:rPr>
+          <w:sz w:val="32"/>
+          <w:szCs w:val="32"/>
+        </w:rPr>
+      </w:pPr>
+      <w:r>
+        <w:rPr>
+          <w:sz w:val="32"/>
+          <w:szCs w:val="32"/>
+        </w:rPr>
+        <w:t>H</w:t>
+      </w:r>
+      <w:r>
+        <w:rPr>
+          <w:sz w:val="32"/>
+          <w:szCs w:val="32"/>
+        </w:rPr>
+        <w:t xml:space="preserve">ad little interest in observation </w:t>
+      </w:r>
+      <w:r>
+        <w:rPr>
+          <w:sz w:val="32"/>
+          <w:szCs w:val="32"/>
+        </w:rPr>
+        <w:t>T</w:t>
+      </w:r>
+      <w:r>
+        <w:rPr>
+          <w:sz w:val="32"/>
+          <w:szCs w:val="32"/>
+        </w:rPr>
+        <w:t>ycho expected him to join his assistants in observation</w:t>
+      </w:r>
+    </w:p>
+    <w:p>
+      <w:pPr>
+        <w:pStyle w:val="ListParagraph"/>
+        <w:numPr>
+          <w:ilvl w:val="0"/>
+          <w:numId w:val="27"/>
+        </w:numPr>
+        <w:rPr>
+          <w:sz w:val="32"/>
+          <w:szCs w:val="32"/>
+        </w:rPr>
+      </w:pPr>
+      <w:r>
+        <w:rPr>
+          <w:sz w:val="32"/>
+          <w:szCs w:val="32"/>
+        </w:rPr>
+        <w:t>Loner by nature and felt extremely uncomfortable in the social, collaborative atmosphere</w:t>
+      </w:r>
+    </w:p>
+    <w:p>
+      <w:pPr>
+        <w:pStyle w:val="ListParagraph"/>
+        <w:numPr>
+          <w:ilvl w:val="0"/>
+          <w:numId w:val="27"/>
+        </w:numPr>
+        <w:rPr>
+          <w:sz w:val="32"/>
+          <w:szCs w:val="32"/>
+        </w:rPr>
+      </w:pPr>
+      <w:r>
+        <w:rPr>
+          <w:sz w:val="32"/>
+          <w:szCs w:val="32"/>
+        </w:rPr>
+        <w:t>S</w:t>
+      </w:r>
+      <w:r>
+        <w:rPr>
+          <w:sz w:val="32"/>
+          <w:szCs w:val="32"/>
+        </w:rPr>
+        <w:t xml:space="preserve">et working on the orbit of Mars by </w:t>
+      </w:r>
+      <w:proofErr w:type="spellStart"/>
+      <w:r>
+        <w:rPr>
+          <w:sz w:val="32"/>
+          <w:szCs w:val="32"/>
+        </w:rPr>
+        <w:t>Longomantanus</w:t>
+      </w:r>
+      <w:proofErr w:type="spellEnd"/>
+      <w:r>
+        <w:rPr>
+          <w:sz w:val="32"/>
+          <w:szCs w:val="32"/>
+        </w:rPr>
+        <w:t>, whilst he (L) worked on Tycho’s Lunar theory</w:t>
+      </w:r>
+    </w:p>
+    <w:p>
+      <w:pPr>
+        <w:pStyle w:val="ListParagraph"/>
+        <w:numPr>
+          <w:ilvl w:val="0"/>
+          <w:numId w:val="27"/>
+        </w:numPr>
+        <w:rPr>
+          <w:sz w:val="32"/>
+          <w:szCs w:val="32"/>
+        </w:rPr>
+      </w:pPr>
+      <w:r>
+        <w:rPr>
+          <w:sz w:val="32"/>
+          <w:szCs w:val="32"/>
+        </w:rPr>
+        <w:t>Pe</w:t>
+      </w:r>
+      <w:r>
+        <w:rPr>
+          <w:sz w:val="32"/>
+          <w:szCs w:val="32"/>
+        </w:rPr>
+        <w:t>stered Tycho for a permanent contract</w:t>
+      </w:r>
+    </w:p>
+    <w:p>
+      <w:pPr>
+        <w:pStyle w:val="ListParagraph"/>
+        <w:numPr>
+          <w:ilvl w:val="1"/>
+          <w:numId w:val="27"/>
+        </w:numPr>
+        <w:rPr>
+          <w:sz w:val="32"/>
+          <w:szCs w:val="32"/>
+        </w:rPr>
+      </w:pPr>
+      <w:r>
+        <w:rPr>
+          <w:sz w:val="32"/>
+          <w:szCs w:val="32"/>
+        </w:rPr>
+        <w:t xml:space="preserve"> Wanted to exempt from observational work, receive a salary from the emperor, have unrestricted access to Tycho’s observations</w:t>
+      </w:r>
+      <w:r>
+        <w:rPr>
+          <w:sz w:val="32"/>
+          <w:szCs w:val="32"/>
+        </w:rPr>
+        <w:t>, and work in his own way – which meant assuming the Copernican model of the Solar System, rather than Tycho’s</w:t>
+      </w:r>
+    </w:p>
+    <w:p>
+      <w:pPr>
+        <w:pStyle w:val="ListParagraph"/>
+        <w:numPr>
+          <w:ilvl w:val="0"/>
+          <w:numId w:val="27"/>
+        </w:numPr>
+        <w:rPr>
+          <w:sz w:val="32"/>
+          <w:szCs w:val="32"/>
+        </w:rPr>
+      </w:pPr>
+      <w:r>
+        <w:rPr>
+          <w:sz w:val="32"/>
+          <w:szCs w:val="32"/>
+        </w:rPr>
+        <w:t xml:space="preserve">Got drunk after </w:t>
+      </w:r>
+      <w:r>
+        <w:rPr>
+          <w:sz w:val="32"/>
+          <w:szCs w:val="32"/>
+        </w:rPr>
+        <w:t xml:space="preserve">Tycho, </w:t>
+      </w:r>
+      <w:proofErr w:type="spellStart"/>
+      <w:r>
+        <w:rPr>
+          <w:sz w:val="32"/>
+          <w:szCs w:val="32"/>
+        </w:rPr>
+        <w:t>Jessenius</w:t>
+      </w:r>
+      <w:proofErr w:type="spellEnd"/>
+      <w:r>
+        <w:rPr>
+          <w:sz w:val="32"/>
+          <w:szCs w:val="32"/>
+        </w:rPr>
+        <w:t xml:space="preserve"> and Kepler met to discuss K’s contract the terms of which Kepler was not pleased with</w:t>
+      </w:r>
+    </w:p>
+    <w:p>
+      <w:pPr>
+        <w:pStyle w:val="ListParagraph"/>
+        <w:numPr>
+          <w:ilvl w:val="1"/>
+          <w:numId w:val="27"/>
+        </w:numPr>
+        <w:rPr>
+          <w:sz w:val="32"/>
+          <w:szCs w:val="32"/>
+        </w:rPr>
+      </w:pPr>
+      <w:r>
+        <w:rPr>
+          <w:sz w:val="32"/>
+          <w:szCs w:val="32"/>
+        </w:rPr>
+        <w:t>Began to rant like ‘a mad dog’</w:t>
+      </w:r>
+    </w:p>
+    <w:p>
+      <w:pPr>
+        <w:pStyle w:val="ListParagraph"/>
+        <w:numPr>
+          <w:ilvl w:val="1"/>
+          <w:numId w:val="27"/>
+        </w:numPr>
+        <w:rPr>
+          <w:sz w:val="32"/>
+          <w:szCs w:val="32"/>
+        </w:rPr>
+      </w:pPr>
+      <w:r>
+        <w:rPr>
+          <w:sz w:val="32"/>
+          <w:szCs w:val="32"/>
+        </w:rPr>
+        <w:t>Offended Tycho and familia</w:t>
+      </w:r>
+    </w:p>
+    <w:p>
+      <w:pPr>
+        <w:pStyle w:val="ListParagraph"/>
+        <w:numPr>
+          <w:ilvl w:val="1"/>
+          <w:numId w:val="27"/>
+        </w:numPr>
+        <w:rPr>
+          <w:sz w:val="32"/>
+          <w:szCs w:val="32"/>
+        </w:rPr>
+      </w:pPr>
+      <w:r>
+        <w:rPr>
+          <w:sz w:val="32"/>
+          <w:szCs w:val="32"/>
+        </w:rPr>
+        <w:t xml:space="preserve">Next day Kepler flared up again, apologized, left </w:t>
+      </w:r>
+      <w:proofErr w:type="spellStart"/>
+      <w:r>
+        <w:rPr>
+          <w:sz w:val="32"/>
+          <w:szCs w:val="32"/>
+        </w:rPr>
+        <w:t>Benatky</w:t>
+      </w:r>
+      <w:proofErr w:type="spellEnd"/>
+      <w:r>
+        <w:rPr>
+          <w:sz w:val="32"/>
+          <w:szCs w:val="32"/>
+        </w:rPr>
+        <w:t xml:space="preserve"> and then wrote </w:t>
+      </w:r>
+      <w:r>
+        <w:rPr>
+          <w:sz w:val="32"/>
+          <w:szCs w:val="32"/>
+        </w:rPr>
+        <w:t>a vitriolic letter to Tycho</w:t>
+      </w:r>
+    </w:p>
+    <w:p>
+      <w:pPr>
+        <w:pStyle w:val="ListParagraph"/>
+        <w:numPr>
+          <w:ilvl w:val="1"/>
+          <w:numId w:val="27"/>
+        </w:numPr>
+        <w:rPr>
+          <w:sz w:val="32"/>
+          <w:szCs w:val="32"/>
+        </w:rPr>
+      </w:pPr>
+      <w:r>
+        <w:rPr>
+          <w:sz w:val="32"/>
+          <w:szCs w:val="32"/>
+        </w:rPr>
+        <w:t>Then after a few days wrote a letter apologising</w:t>
+      </w:r>
+    </w:p>
+    <w:p>
+      <w:pPr>
+        <w:pStyle w:val="ListParagraph"/>
+        <w:numPr>
+          <w:ilvl w:val="1"/>
+          <w:numId w:val="27"/>
+        </w:numPr>
+        <w:rPr>
+          <w:sz w:val="32"/>
+          <w:szCs w:val="32"/>
+        </w:rPr>
+      </w:pPr>
+      <w:r>
+        <w:rPr>
+          <w:sz w:val="32"/>
+          <w:szCs w:val="32"/>
+        </w:rPr>
+        <w:t>A few days after receiving this letter, Tycho took him back</w:t>
+      </w:r>
+    </w:p>
+    <w:p>
+      <w:pPr>
+        <w:ind w:left="720"/>
+        <w:rPr>
+          <w:sz w:val="32"/>
+          <w:szCs w:val="32"/>
+        </w:rPr>
+      </w:pPr>
+      <w:r>
+        <w:rPr>
+          <w:sz w:val="32"/>
+          <w:szCs w:val="32"/>
+        </w:rPr>
+        <w:t xml:space="preserve">June 1600: Rudolph II </w:t>
+      </w:r>
+      <w:r>
+        <w:rPr>
+          <w:sz w:val="32"/>
+          <w:szCs w:val="32"/>
+        </w:rPr>
+        <w:t xml:space="preserve"> </w:t>
+      </w:r>
+    </w:p>
+    <w:p>
+      <w:pPr>
+        <w:ind w:left="720"/>
+        <w:rPr>
+          <w:sz w:val="32"/>
+          <w:szCs w:val="32"/>
+        </w:rPr>
+      </w:pPr>
+    </w:p>
+    <w:p>
+      <w:pPr>
+        <w:ind w:left="720"/>
+        <w:rPr>
+          <w:sz w:val="32"/>
+          <w:szCs w:val="32"/>
+        </w:rPr>
+      </w:pPr>
+    </w:p>
+    <w:p>
+      <w:pPr>
+        <w:rPr>
+          <w:sz w:val="32"/>
+          <w:szCs w:val="32"/>
+        </w:rPr>
+      </w:pPr>
+      <w:r>
+        <w:rPr>
+          <w:sz w:val="32"/>
+          <w:szCs w:val="32"/>
+        </w:rPr>
+        <w:tab/>
+      </w:r>
+    </w:p>
+    <w:p>
+      <w:pPr>
+        <w:rPr>
+          <w:sz w:val="32"/>
+          <w:szCs w:val="32"/>
+        </w:rPr>
+      </w:pPr>
+    </w:p>
+    <w:p>
+      <w:pPr>
+        <w:rPr>
+          <w:sz w:val="32"/>
+          <w:szCs w:val="32"/>
+        </w:rPr>
+      </w:pPr>
+    </w:p>
+    <w:p>
+      <w:pPr>
+        <w:rPr>
+          <w:sz w:val="32"/>
+          <w:szCs w:val="32"/>
+        </w:rPr>
+      </w:pPr>
+    </w:p>
+    <w:p>
+      <w:pPr>
+        <w:rPr>
+          <w:sz w:val="32"/>
+          <w:szCs w:val="32"/>
+        </w:rPr>
+      </w:pPr>
+    </w:p>
+    <w:p>
+      <w:pPr>
+        <w:rPr>
+          <w:sz w:val="32"/>
+          <w:szCs w:val="32"/>
+        </w:rPr>
+      </w:pPr>
+    </w:p>
+    <w:p>
+      <w:pPr>
+        <w:rPr>
+          <w:sz w:val="32"/>
+          <w:szCs w:val="32"/>
+        </w:rPr>
+      </w:pPr>
+    </w:p>
+    <w:p>
+      <w:pPr>
+        <w:rPr>
+          <w:b/>
+          <w:bCs/>
+          <w:sz w:val="32"/>
+          <w:szCs w:val="32"/>
         </w:rPr>
       </w:pPr>
     </w:p>
@@ -2178,6 +4596,530 @@
     </w:lvl>
   </w:abstractNum>
   <w:abstractNum w:abstractNumId="3" w15:restartNumberingAfterBreak="0">
+    <w:nsid w:val="0B2A7BB5"/>
+    <w:multiLevelType w:val="hybridMultilevel"/>
+    <w:tmpl w:val="39E0D8EC"/>
+    <w:lvl w:ilvl="0" w:tplc="08090001">
+      <w:start w:val="1"/>
+      <w:numFmt w:val="bullet"/>
+      <w:lvlText w:val=""/>
+      <w:lvlJc w:val="left"/>
+      <w:pPr>
+        <w:ind w:left="1080" w:hanging="360"/>
+      </w:pPr>
+      <w:rPr>
+        <w:rFonts w:ascii="Symbol" w:hAnsi="Symbol" w:hint="default"/>
+      </w:rPr>
+    </w:lvl>
+    <w:lvl w:ilvl="1" w:tplc="08090003" w:tentative="1">
+      <w:start w:val="1"/>
+      <w:numFmt w:val="bullet"/>
+      <w:lvlText w:val="o"/>
+      <w:lvlJc w:val="left"/>
+      <w:pPr>
+        <w:ind w:left="1800" w:hanging="360"/>
+      </w:pPr>
+      <w:rPr>
+        <w:rFonts w:ascii="Courier New" w:hAnsi="Courier New" w:cs="Courier New" w:hint="default"/>
+      </w:rPr>
+    </w:lvl>
+    <w:lvl w:ilvl="2" w:tplc="08090005" w:tentative="1">
+      <w:start w:val="1"/>
+      <w:numFmt w:val="bullet"/>
+      <w:lvlText w:val=""/>
+      <w:lvlJc w:val="left"/>
+      <w:pPr>
+        <w:ind w:left="2520" w:hanging="360"/>
+      </w:pPr>
+      <w:rPr>
+        <w:rFonts w:ascii="Wingdings" w:hAnsi="Wingdings" w:hint="default"/>
+      </w:rPr>
+    </w:lvl>
+    <w:lvl w:ilvl="3" w:tplc="08090001" w:tentative="1">
+      <w:start w:val="1"/>
+      <w:numFmt w:val="bullet"/>
+      <w:lvlText w:val=""/>
+      <w:lvlJc w:val="left"/>
+      <w:pPr>
+        <w:ind w:left="3240" w:hanging="360"/>
+      </w:pPr>
+      <w:rPr>
+        <w:rFonts w:ascii="Symbol" w:hAnsi="Symbol" w:hint="default"/>
+      </w:rPr>
+    </w:lvl>
+    <w:lvl w:ilvl="4" w:tplc="08090003" w:tentative="1">
+      <w:start w:val="1"/>
+      <w:numFmt w:val="bullet"/>
+      <w:lvlText w:val="o"/>
+      <w:lvlJc w:val="left"/>
+      <w:pPr>
+        <w:ind w:left="3960" w:hanging="360"/>
+      </w:pPr>
+      <w:rPr>
+        <w:rFonts w:ascii="Courier New" w:hAnsi="Courier New" w:cs="Courier New" w:hint="default"/>
+      </w:rPr>
+    </w:lvl>
+    <w:lvl w:ilvl="5" w:tplc="08090005" w:tentative="1">
+      <w:start w:val="1"/>
+      <w:numFmt w:val="bullet"/>
+      <w:lvlText w:val=""/>
+      <w:lvlJc w:val="left"/>
+      <w:pPr>
+        <w:ind w:left="4680" w:hanging="360"/>
+      </w:pPr>
+      <w:rPr>
+        <w:rFonts w:ascii="Wingdings" w:hAnsi="Wingdings" w:hint="default"/>
+      </w:rPr>
+    </w:lvl>
+    <w:lvl w:ilvl="6" w:tplc="08090001" w:tentative="1">
+      <w:start w:val="1"/>
+      <w:numFmt w:val="bullet"/>
+      <w:lvlText w:val=""/>
+      <w:lvlJc w:val="left"/>
+      <w:pPr>
+        <w:ind w:left="5400" w:hanging="360"/>
+      </w:pPr>
+      <w:rPr>
+        <w:rFonts w:ascii="Symbol" w:hAnsi="Symbol" w:hint="default"/>
+      </w:rPr>
+    </w:lvl>
+    <w:lvl w:ilvl="7" w:tplc="08090003" w:tentative="1">
+      <w:start w:val="1"/>
+      <w:numFmt w:val="bullet"/>
+      <w:lvlText w:val="o"/>
+      <w:lvlJc w:val="left"/>
+      <w:pPr>
+        <w:ind w:left="6120" w:hanging="360"/>
+      </w:pPr>
+      <w:rPr>
+        <w:rFonts w:ascii="Courier New" w:hAnsi="Courier New" w:cs="Courier New" w:hint="default"/>
+      </w:rPr>
+    </w:lvl>
+    <w:lvl w:ilvl="8" w:tplc="08090005" w:tentative="1">
+      <w:start w:val="1"/>
+      <w:numFmt w:val="bullet"/>
+      <w:lvlText w:val=""/>
+      <w:lvlJc w:val="left"/>
+      <w:pPr>
+        <w:ind w:left="6840" w:hanging="360"/>
+      </w:pPr>
+      <w:rPr>
+        <w:rFonts w:ascii="Wingdings" w:hAnsi="Wingdings" w:hint="default"/>
+      </w:rPr>
+    </w:lvl>
+  </w:abstractNum>
+  <w:abstractNum w:abstractNumId="4" w15:restartNumberingAfterBreak="0">
+    <w:nsid w:val="0BE163D6"/>
+    <w:multiLevelType w:val="hybridMultilevel"/>
+    <w:tmpl w:val="E80824AA"/>
+    <w:lvl w:ilvl="0" w:tplc="08090001">
+      <w:start w:val="1"/>
+      <w:numFmt w:val="bullet"/>
+      <w:lvlText w:val=""/>
+      <w:lvlJc w:val="left"/>
+      <w:pPr>
+        <w:ind w:left="1080" w:hanging="360"/>
+      </w:pPr>
+      <w:rPr>
+        <w:rFonts w:ascii="Symbol" w:hAnsi="Symbol" w:hint="default"/>
+      </w:rPr>
+    </w:lvl>
+    <w:lvl w:ilvl="1" w:tplc="08090003">
+      <w:start w:val="1"/>
+      <w:numFmt w:val="bullet"/>
+      <w:lvlText w:val="o"/>
+      <w:lvlJc w:val="left"/>
+      <w:pPr>
+        <w:ind w:left="1800" w:hanging="360"/>
+      </w:pPr>
+      <w:rPr>
+        <w:rFonts w:ascii="Courier New" w:hAnsi="Courier New" w:cs="Courier New" w:hint="default"/>
+      </w:rPr>
+    </w:lvl>
+    <w:lvl w:ilvl="2" w:tplc="08090005" w:tentative="1">
+      <w:start w:val="1"/>
+      <w:numFmt w:val="bullet"/>
+      <w:lvlText w:val=""/>
+      <w:lvlJc w:val="left"/>
+      <w:pPr>
+        <w:ind w:left="2520" w:hanging="360"/>
+      </w:pPr>
+      <w:rPr>
+        <w:rFonts w:ascii="Wingdings" w:hAnsi="Wingdings" w:hint="default"/>
+      </w:rPr>
+    </w:lvl>
+    <w:lvl w:ilvl="3" w:tplc="08090001" w:tentative="1">
+      <w:start w:val="1"/>
+      <w:numFmt w:val="bullet"/>
+      <w:lvlText w:val=""/>
+      <w:lvlJc w:val="left"/>
+      <w:pPr>
+        <w:ind w:left="3240" w:hanging="360"/>
+      </w:pPr>
+      <w:rPr>
+        <w:rFonts w:ascii="Symbol" w:hAnsi="Symbol" w:hint="default"/>
+      </w:rPr>
+    </w:lvl>
+    <w:lvl w:ilvl="4" w:tplc="08090003" w:tentative="1">
+      <w:start w:val="1"/>
+      <w:numFmt w:val="bullet"/>
+      <w:lvlText w:val="o"/>
+      <w:lvlJc w:val="left"/>
+      <w:pPr>
+        <w:ind w:left="3960" w:hanging="360"/>
+      </w:pPr>
+      <w:rPr>
+        <w:rFonts w:ascii="Courier New" w:hAnsi="Courier New" w:cs="Courier New" w:hint="default"/>
+      </w:rPr>
+    </w:lvl>
+    <w:lvl w:ilvl="5" w:tplc="08090005" w:tentative="1">
+      <w:start w:val="1"/>
+      <w:numFmt w:val="bullet"/>
+      <w:lvlText w:val=""/>
+      <w:lvlJc w:val="left"/>
+      <w:pPr>
+        <w:ind w:left="4680" w:hanging="360"/>
+      </w:pPr>
+      <w:rPr>
+        <w:rFonts w:ascii="Wingdings" w:hAnsi="Wingdings" w:hint="default"/>
+      </w:rPr>
+    </w:lvl>
+    <w:lvl w:ilvl="6" w:tplc="08090001" w:tentative="1">
+      <w:start w:val="1"/>
+      <w:numFmt w:val="bullet"/>
+      <w:lvlText w:val=""/>
+      <w:lvlJc w:val="left"/>
+      <w:pPr>
+        <w:ind w:left="5400" w:hanging="360"/>
+      </w:pPr>
+      <w:rPr>
+        <w:rFonts w:ascii="Symbol" w:hAnsi="Symbol" w:hint="default"/>
+      </w:rPr>
+    </w:lvl>
+    <w:lvl w:ilvl="7" w:tplc="08090003" w:tentative="1">
+      <w:start w:val="1"/>
+      <w:numFmt w:val="bullet"/>
+      <w:lvlText w:val="o"/>
+      <w:lvlJc w:val="left"/>
+      <w:pPr>
+        <w:ind w:left="6120" w:hanging="360"/>
+      </w:pPr>
+      <w:rPr>
+        <w:rFonts w:ascii="Courier New" w:hAnsi="Courier New" w:cs="Courier New" w:hint="default"/>
+      </w:rPr>
+    </w:lvl>
+    <w:lvl w:ilvl="8" w:tplc="08090005" w:tentative="1">
+      <w:start w:val="1"/>
+      <w:numFmt w:val="bullet"/>
+      <w:lvlText w:val=""/>
+      <w:lvlJc w:val="left"/>
+      <w:pPr>
+        <w:ind w:left="6840" w:hanging="360"/>
+      </w:pPr>
+      <w:rPr>
+        <w:rFonts w:ascii="Wingdings" w:hAnsi="Wingdings" w:hint="default"/>
+      </w:rPr>
+    </w:lvl>
+  </w:abstractNum>
+  <w:abstractNum w:abstractNumId="5" w15:restartNumberingAfterBreak="0">
+    <w:nsid w:val="10751DB3"/>
+    <w:multiLevelType w:val="multilevel"/>
+    <w:tmpl w:val="25907CD8"/>
+    <w:lvl w:ilvl="0">
+      <w:start w:val="1"/>
+      <w:numFmt w:val="bullet"/>
+      <w:lvlText w:val=""/>
+      <w:lvlJc w:val="left"/>
+      <w:pPr>
+        <w:tabs>
+          <w:tab w:val="num" w:pos="720"/>
+        </w:tabs>
+        <w:ind w:left="720" w:hanging="360"/>
+      </w:pPr>
+      <w:rPr>
+        <w:rFonts w:ascii="Symbol" w:hAnsi="Symbol" w:hint="default"/>
+        <w:sz w:val="20"/>
+      </w:rPr>
+    </w:lvl>
+    <w:lvl w:ilvl="1" w:tentative="1">
+      <w:start w:val="1"/>
+      <w:numFmt w:val="bullet"/>
+      <w:lvlText w:val="o"/>
+      <w:lvlJc w:val="left"/>
+      <w:pPr>
+        <w:tabs>
+          <w:tab w:val="num" w:pos="1440"/>
+        </w:tabs>
+        <w:ind w:left="1440" w:hanging="360"/>
+      </w:pPr>
+      <w:rPr>
+        <w:rFonts w:ascii="Courier New" w:hAnsi="Courier New" w:hint="default"/>
+        <w:sz w:val="20"/>
+      </w:rPr>
+    </w:lvl>
+    <w:lvl w:ilvl="2" w:tentative="1">
+      <w:start w:val="1"/>
+      <w:numFmt w:val="bullet"/>
+      <w:lvlText w:val=""/>
+      <w:lvlJc w:val="left"/>
+      <w:pPr>
+        <w:tabs>
+          <w:tab w:val="num" w:pos="2160"/>
+        </w:tabs>
+        <w:ind w:left="2160" w:hanging="360"/>
+      </w:pPr>
+      <w:rPr>
+        <w:rFonts w:ascii="Wingdings" w:hAnsi="Wingdings" w:hint="default"/>
+        <w:sz w:val="20"/>
+      </w:rPr>
+    </w:lvl>
+    <w:lvl w:ilvl="3" w:tentative="1">
+      <w:start w:val="1"/>
+      <w:numFmt w:val="bullet"/>
+      <w:lvlText w:val=""/>
+      <w:lvlJc w:val="left"/>
+      <w:pPr>
+        <w:tabs>
+          <w:tab w:val="num" w:pos="2880"/>
+        </w:tabs>
+        <w:ind w:left="2880" w:hanging="360"/>
+      </w:pPr>
+      <w:rPr>
+        <w:rFonts w:ascii="Wingdings" w:hAnsi="Wingdings" w:hint="default"/>
+        <w:sz w:val="20"/>
+      </w:rPr>
+    </w:lvl>
+    <w:lvl w:ilvl="4" w:tentative="1">
+      <w:start w:val="1"/>
+      <w:numFmt w:val="bullet"/>
+      <w:lvlText w:val=""/>
+      <w:lvlJc w:val="left"/>
+      <w:pPr>
+        <w:tabs>
+          <w:tab w:val="num" w:pos="3600"/>
+        </w:tabs>
+        <w:ind w:left="3600" w:hanging="360"/>
+      </w:pPr>
+      <w:rPr>
+        <w:rFonts w:ascii="Wingdings" w:hAnsi="Wingdings" w:hint="default"/>
+        <w:sz w:val="20"/>
+      </w:rPr>
+    </w:lvl>
+    <w:lvl w:ilvl="5" w:tentative="1">
+      <w:start w:val="1"/>
+      <w:numFmt w:val="bullet"/>
+      <w:lvlText w:val=""/>
+      <w:lvlJc w:val="left"/>
+      <w:pPr>
+        <w:tabs>
+          <w:tab w:val="num" w:pos="4320"/>
+        </w:tabs>
+        <w:ind w:left="4320" w:hanging="360"/>
+      </w:pPr>
+      <w:rPr>
+        <w:rFonts w:ascii="Wingdings" w:hAnsi="Wingdings" w:hint="default"/>
+        <w:sz w:val="20"/>
+      </w:rPr>
+    </w:lvl>
+    <w:lvl w:ilvl="6" w:tentative="1">
+      <w:start w:val="1"/>
+      <w:numFmt w:val="bullet"/>
+      <w:lvlText w:val=""/>
+      <w:lvlJc w:val="left"/>
+      <w:pPr>
+        <w:tabs>
+          <w:tab w:val="num" w:pos="5040"/>
+        </w:tabs>
+        <w:ind w:left="5040" w:hanging="360"/>
+      </w:pPr>
+      <w:rPr>
+        <w:rFonts w:ascii="Wingdings" w:hAnsi="Wingdings" w:hint="default"/>
+        <w:sz w:val="20"/>
+      </w:rPr>
+    </w:lvl>
+    <w:lvl w:ilvl="7" w:tentative="1">
+      <w:start w:val="1"/>
+      <w:numFmt w:val="bullet"/>
+      <w:lvlText w:val=""/>
+      <w:lvlJc w:val="left"/>
+      <w:pPr>
+        <w:tabs>
+          <w:tab w:val="num" w:pos="5760"/>
+        </w:tabs>
+        <w:ind w:left="5760" w:hanging="360"/>
+      </w:pPr>
+      <w:rPr>
+        <w:rFonts w:ascii="Wingdings" w:hAnsi="Wingdings" w:hint="default"/>
+        <w:sz w:val="20"/>
+      </w:rPr>
+    </w:lvl>
+    <w:lvl w:ilvl="8" w:tentative="1">
+      <w:start w:val="1"/>
+      <w:numFmt w:val="bullet"/>
+      <w:lvlText w:val=""/>
+      <w:lvlJc w:val="left"/>
+      <w:pPr>
+        <w:tabs>
+          <w:tab w:val="num" w:pos="6480"/>
+        </w:tabs>
+        <w:ind w:left="6480" w:hanging="360"/>
+      </w:pPr>
+      <w:rPr>
+        <w:rFonts w:ascii="Wingdings" w:hAnsi="Wingdings" w:hint="default"/>
+        <w:sz w:val="20"/>
+      </w:rPr>
+    </w:lvl>
+  </w:abstractNum>
+  <w:abstractNum w:abstractNumId="6" w15:restartNumberingAfterBreak="0">
+    <w:nsid w:val="1B58303E"/>
+    <w:multiLevelType w:val="multilevel"/>
+    <w:tmpl w:val="E5660F4A"/>
+    <w:lvl w:ilvl="0">
+      <w:start w:val="1"/>
+      <w:numFmt w:val="bullet"/>
+      <w:lvlText w:val=""/>
+      <w:lvlJc w:val="left"/>
+      <w:pPr>
+        <w:tabs>
+          <w:tab w:val="num" w:pos="720"/>
+        </w:tabs>
+        <w:ind w:left="720" w:hanging="360"/>
+      </w:pPr>
+      <w:rPr>
+        <w:rFonts w:ascii="Symbol" w:hAnsi="Symbol" w:hint="default"/>
+        <w:sz w:val="20"/>
+      </w:rPr>
+    </w:lvl>
+    <w:lvl w:ilvl="1" w:tentative="1">
+      <w:start w:val="1"/>
+      <w:numFmt w:val="bullet"/>
+      <w:lvlText w:val=""/>
+      <w:lvlJc w:val="left"/>
+      <w:pPr>
+        <w:tabs>
+          <w:tab w:val="num" w:pos="1440"/>
+        </w:tabs>
+        <w:ind w:left="1440" w:hanging="360"/>
+      </w:pPr>
+      <w:rPr>
+        <w:rFonts w:ascii="Symbol" w:hAnsi="Symbol" w:hint="default"/>
+        <w:sz w:val="20"/>
+      </w:rPr>
+    </w:lvl>
+    <w:lvl w:ilvl="2" w:tentative="1">
+      <w:start w:val="1"/>
+      <w:numFmt w:val="bullet"/>
+      <w:lvlText w:val=""/>
+      <w:lvlJc w:val="left"/>
+      <w:pPr>
+        <w:tabs>
+          <w:tab w:val="num" w:pos="2160"/>
+        </w:tabs>
+        <w:ind w:left="2160" w:hanging="360"/>
+      </w:pPr>
+      <w:rPr>
+        <w:rFonts w:ascii="Symbol" w:hAnsi="Symbol" w:hint="default"/>
+        <w:sz w:val="20"/>
+      </w:rPr>
+    </w:lvl>
+    <w:lvl w:ilvl="3" w:tentative="1">
+      <w:start w:val="1"/>
+      <w:numFmt w:val="bullet"/>
+      <w:lvlText w:val=""/>
+      <w:lvlJc w:val="left"/>
+      <w:pPr>
+        <w:tabs>
+          <w:tab w:val="num" w:pos="2880"/>
+        </w:tabs>
+        <w:ind w:left="2880" w:hanging="360"/>
+      </w:pPr>
+      <w:rPr>
+        <w:rFonts w:ascii="Symbol" w:hAnsi="Symbol" w:hint="default"/>
+        <w:sz w:val="20"/>
+      </w:rPr>
+    </w:lvl>
+    <w:lvl w:ilvl="4" w:tentative="1">
+      <w:start w:val="1"/>
+      <w:numFmt w:val="bullet"/>
+      <w:lvlText w:val=""/>
+      <w:lvlJc w:val="left"/>
+      <w:pPr>
+        <w:tabs>
+          <w:tab w:val="num" w:pos="3600"/>
+        </w:tabs>
+        <w:ind w:left="3600" w:hanging="360"/>
+      </w:pPr>
+      <w:rPr>
+        <w:rFonts w:ascii="Symbol" w:hAnsi="Symbol" w:hint="default"/>
+        <w:sz w:val="20"/>
+      </w:rPr>
+    </w:lvl>
+    <w:lvl w:ilvl="5" w:tentative="1">
+      <w:start w:val="1"/>
+      <w:numFmt w:val="bullet"/>
+      <w:lvlText w:val=""/>
+      <w:lvlJc w:val="left"/>
+      <w:pPr>
+        <w:tabs>
+          <w:tab w:val="num" w:pos="4320"/>
+        </w:tabs>
+        <w:ind w:left="4320" w:hanging="360"/>
+      </w:pPr>
+      <w:rPr>
+        <w:rFonts w:ascii="Symbol" w:hAnsi="Symbol" w:hint="default"/>
+        <w:sz w:val="20"/>
+      </w:rPr>
+    </w:lvl>
+    <w:lvl w:ilvl="6" w:tentative="1">
+      <w:start w:val="1"/>
+      <w:numFmt w:val="bullet"/>
+      <w:lvlText w:val=""/>
+      <w:lvlJc w:val="left"/>
+      <w:pPr>
+        <w:tabs>
+          <w:tab w:val="num" w:pos="5040"/>
+        </w:tabs>
+        <w:ind w:left="5040" w:hanging="360"/>
+      </w:pPr>
+      <w:rPr>
+        <w:rFonts w:ascii="Symbol" w:hAnsi="Symbol" w:hint="default"/>
+        <w:sz w:val="20"/>
+      </w:rPr>
+    </w:lvl>
+    <w:lvl w:ilvl="7" w:tentative="1">
+      <w:start w:val="1"/>
+      <w:numFmt w:val="bullet"/>
+      <w:lvlText w:val=""/>
+      <w:lvlJc w:val="left"/>
+      <w:pPr>
+        <w:tabs>
+          <w:tab w:val="num" w:pos="5760"/>
+        </w:tabs>
+        <w:ind w:left="5760" w:hanging="360"/>
+      </w:pPr>
+      <w:rPr>
+        <w:rFonts w:ascii="Symbol" w:hAnsi="Symbol" w:hint="default"/>
+        <w:sz w:val="20"/>
+      </w:rPr>
+    </w:lvl>
+    <w:lvl w:ilvl="8" w:tentative="1">
+      <w:start w:val="1"/>
+      <w:numFmt w:val="bullet"/>
+      <w:lvlText w:val=""/>
+      <w:lvlJc w:val="left"/>
+      <w:pPr>
+        <w:tabs>
+          <w:tab w:val="num" w:pos="6480"/>
+        </w:tabs>
+        <w:ind w:left="6480" w:hanging="360"/>
+      </w:pPr>
+      <w:rPr>
+        <w:rFonts w:ascii="Symbol" w:hAnsi="Symbol" w:hint="default"/>
+        <w:sz w:val="20"/>
+      </w:rPr>
+    </w:lvl>
+  </w:abstractNum>
+  <w:abstractNum w:abstractNumId="7" w15:restartNumberingAfterBreak="0">
     <w:nsid w:val="1C646C0F"/>
     <w:multiLevelType w:val="hybridMultilevel"/>
     <w:tmpl w:val="803CEB86"/>
@@ -2290,7 +5232,120 @@
       </w:rPr>
     </w:lvl>
   </w:abstractNum>
-  <w:abstractNum w:abstractNumId="4" w15:restartNumberingAfterBreak="0">
+  <w:abstractNum w:abstractNumId="8" w15:restartNumberingAfterBreak="0">
+    <w:nsid w:val="1F5129B6"/>
+    <w:multiLevelType w:val="hybridMultilevel"/>
+    <w:tmpl w:val="AB4C120E"/>
+    <w:lvl w:ilvl="0" w:tplc="08090001">
+      <w:start w:val="1"/>
+      <w:numFmt w:val="bullet"/>
+      <w:lvlText w:val=""/>
+      <w:lvlJc w:val="left"/>
+      <w:pPr>
+        <w:ind w:left="1080" w:hanging="360"/>
+      </w:pPr>
+      <w:rPr>
+        <w:rFonts w:ascii="Symbol" w:hAnsi="Symbol" w:hint="default"/>
+      </w:rPr>
+    </w:lvl>
+    <w:lvl w:ilvl="1" w:tplc="08090003">
+      <w:start w:val="1"/>
+      <w:numFmt w:val="bullet"/>
+      <w:lvlText w:val="o"/>
+      <w:lvlJc w:val="left"/>
+      <w:pPr>
+        <w:ind w:left="1800" w:hanging="360"/>
+      </w:pPr>
+      <w:rPr>
+        <w:rFonts w:ascii="Courier New" w:hAnsi="Courier New" w:cs="Courier New" w:hint="default"/>
+      </w:rPr>
+    </w:lvl>
+    <w:lvl w:ilvl="2" w:tplc="08090005" w:tentative="1">
+      <w:start w:val="1"/>
+      <w:numFmt w:val="bullet"/>
+      <w:lvlText w:val=""/>
+      <w:lvlJc w:val="left"/>
+      <w:pPr>
+        <w:ind w:left="2520" w:hanging="360"/>
+      </w:pPr>
+      <w:rPr>
+        <w:rFonts w:ascii="Wingdings" w:hAnsi="Wingdings" w:hint="default"/>
+      </w:rPr>
+    </w:lvl>
+    <w:lvl w:ilvl="3" w:tplc="08090001" w:tentative="1">
+      <w:start w:val="1"/>
+      <w:numFmt w:val="bullet"/>
+      <w:lvlText w:val=""/>
+      <w:lvlJc w:val="left"/>
+      <w:pPr>
+        <w:ind w:left="3240" w:hanging="360"/>
+      </w:pPr>
+      <w:rPr>
+        <w:rFonts w:ascii="Symbol" w:hAnsi="Symbol" w:hint="default"/>
+      </w:rPr>
+    </w:lvl>
+    <w:lvl w:ilvl="4" w:tplc="08090003" w:tentative="1">
+      <w:start w:val="1"/>
+      <w:numFmt w:val="bullet"/>
+      <w:lvlText w:val="o"/>
+      <w:lvlJc w:val="left"/>
+      <w:pPr>
+        <w:ind w:left="3960" w:hanging="360"/>
+      </w:pPr>
+      <w:rPr>
+        <w:rFonts w:ascii="Courier New" w:hAnsi="Courier New" w:cs="Courier New" w:hint="default"/>
+      </w:rPr>
+    </w:lvl>
+    <w:lvl w:ilvl="5" w:tplc="08090005" w:tentative="1">
+      <w:start w:val="1"/>
+      <w:numFmt w:val="bullet"/>
+      <w:lvlText w:val=""/>
+      <w:lvlJc w:val="left"/>
+      <w:pPr>
+        <w:ind w:left="4680" w:hanging="360"/>
+      </w:pPr>
+      <w:rPr>
+        <w:rFonts w:ascii="Wingdings" w:hAnsi="Wingdings" w:hint="default"/>
+      </w:rPr>
+    </w:lvl>
+    <w:lvl w:ilvl="6" w:tplc="08090001" w:tentative="1">
+      <w:start w:val="1"/>
+      <w:numFmt w:val="bullet"/>
+      <w:lvlText w:val=""/>
+      <w:lvlJc w:val="left"/>
+      <w:pPr>
+        <w:ind w:left="5400" w:hanging="360"/>
+      </w:pPr>
+      <w:rPr>
+        <w:rFonts w:ascii="Symbol" w:hAnsi="Symbol" w:hint="default"/>
+      </w:rPr>
+    </w:lvl>
+    <w:lvl w:ilvl="7" w:tplc="08090003" w:tentative="1">
+      <w:start w:val="1"/>
+      <w:numFmt w:val="bullet"/>
+      <w:lvlText w:val="o"/>
+      <w:lvlJc w:val="left"/>
+      <w:pPr>
+        <w:ind w:left="6120" w:hanging="360"/>
+      </w:pPr>
+      <w:rPr>
+        <w:rFonts w:ascii="Courier New" w:hAnsi="Courier New" w:cs="Courier New" w:hint="default"/>
+      </w:rPr>
+    </w:lvl>
+    <w:lvl w:ilvl="8" w:tplc="08090005" w:tentative="1">
+      <w:start w:val="1"/>
+      <w:numFmt w:val="bullet"/>
+      <w:lvlText w:val=""/>
+      <w:lvlJc w:val="left"/>
+      <w:pPr>
+        <w:ind w:left="6840" w:hanging="360"/>
+      </w:pPr>
+      <w:rPr>
+        <w:rFonts w:ascii="Wingdings" w:hAnsi="Wingdings" w:hint="default"/>
+      </w:rPr>
+    </w:lvl>
+  </w:abstractNum>
+  <w:abstractNum w:abstractNumId="9" w15:restartNumberingAfterBreak="0">
     <w:nsid w:val="25FD0BDD"/>
     <w:multiLevelType w:val="hybridMultilevel"/>
     <w:tmpl w:val="7800F7B2"/>
@@ -2403,7 +5458,120 @@
       </w:rPr>
     </w:lvl>
   </w:abstractNum>
-  <w:abstractNum w:abstractNumId="5" w15:restartNumberingAfterBreak="0">
+  <w:abstractNum w:abstractNumId="10" w15:restartNumberingAfterBreak="0">
+    <w:nsid w:val="2698584C"/>
+    <w:multiLevelType w:val="hybridMultilevel"/>
+    <w:tmpl w:val="28C8D39E"/>
+    <w:lvl w:ilvl="0" w:tplc="08090001">
+      <w:start w:val="1"/>
+      <w:numFmt w:val="bullet"/>
+      <w:lvlText w:val=""/>
+      <w:lvlJc w:val="left"/>
+      <w:pPr>
+        <w:ind w:left="1080" w:hanging="360"/>
+      </w:pPr>
+      <w:rPr>
+        <w:rFonts w:ascii="Symbol" w:hAnsi="Symbol" w:hint="default"/>
+      </w:rPr>
+    </w:lvl>
+    <w:lvl w:ilvl="1" w:tplc="08090003" w:tentative="1">
+      <w:start w:val="1"/>
+      <w:numFmt w:val="bullet"/>
+      <w:lvlText w:val="o"/>
+      <w:lvlJc w:val="left"/>
+      <w:pPr>
+        <w:ind w:left="1800" w:hanging="360"/>
+      </w:pPr>
+      <w:rPr>
+        <w:rFonts w:ascii="Courier New" w:hAnsi="Courier New" w:cs="Courier New" w:hint="default"/>
+      </w:rPr>
+    </w:lvl>
+    <w:lvl w:ilvl="2" w:tplc="08090005" w:tentative="1">
+      <w:start w:val="1"/>
+      <w:numFmt w:val="bullet"/>
+      <w:lvlText w:val=""/>
+      <w:lvlJc w:val="left"/>
+      <w:pPr>
+        <w:ind w:left="2520" w:hanging="360"/>
+      </w:pPr>
+      <w:rPr>
+        <w:rFonts w:ascii="Wingdings" w:hAnsi="Wingdings" w:hint="default"/>
+      </w:rPr>
+    </w:lvl>
+    <w:lvl w:ilvl="3" w:tplc="08090001" w:tentative="1">
+      <w:start w:val="1"/>
+      <w:numFmt w:val="bullet"/>
+      <w:lvlText w:val=""/>
+      <w:lvlJc w:val="left"/>
+      <w:pPr>
+        <w:ind w:left="3240" w:hanging="360"/>
+      </w:pPr>
+      <w:rPr>
+        <w:rFonts w:ascii="Symbol" w:hAnsi="Symbol" w:hint="default"/>
+      </w:rPr>
+    </w:lvl>
+    <w:lvl w:ilvl="4" w:tplc="08090003" w:tentative="1">
+      <w:start w:val="1"/>
+      <w:numFmt w:val="bullet"/>
+      <w:lvlText w:val="o"/>
+      <w:lvlJc w:val="left"/>
+      <w:pPr>
+        <w:ind w:left="3960" w:hanging="360"/>
+      </w:pPr>
+      <w:rPr>
+        <w:rFonts w:ascii="Courier New" w:hAnsi="Courier New" w:cs="Courier New" w:hint="default"/>
+      </w:rPr>
+    </w:lvl>
+    <w:lvl w:ilvl="5" w:tplc="08090005" w:tentative="1">
+      <w:start w:val="1"/>
+      <w:numFmt w:val="bullet"/>
+      <w:lvlText w:val=""/>
+      <w:lvlJc w:val="left"/>
+      <w:pPr>
+        <w:ind w:left="4680" w:hanging="360"/>
+      </w:pPr>
+      <w:rPr>
+        <w:rFonts w:ascii="Wingdings" w:hAnsi="Wingdings" w:hint="default"/>
+      </w:rPr>
+    </w:lvl>
+    <w:lvl w:ilvl="6" w:tplc="08090001" w:tentative="1">
+      <w:start w:val="1"/>
+      <w:numFmt w:val="bullet"/>
+      <w:lvlText w:val=""/>
+      <w:lvlJc w:val="left"/>
+      <w:pPr>
+        <w:ind w:left="5400" w:hanging="360"/>
+      </w:pPr>
+      <w:rPr>
+        <w:rFonts w:ascii="Symbol" w:hAnsi="Symbol" w:hint="default"/>
+      </w:rPr>
+    </w:lvl>
+    <w:lvl w:ilvl="7" w:tplc="08090003" w:tentative="1">
+      <w:start w:val="1"/>
+      <w:numFmt w:val="bullet"/>
+      <w:lvlText w:val="o"/>
+      <w:lvlJc w:val="left"/>
+      <w:pPr>
+        <w:ind w:left="6120" w:hanging="360"/>
+      </w:pPr>
+      <w:rPr>
+        <w:rFonts w:ascii="Courier New" w:hAnsi="Courier New" w:cs="Courier New" w:hint="default"/>
+      </w:rPr>
+    </w:lvl>
+    <w:lvl w:ilvl="8" w:tplc="08090005" w:tentative="1">
+      <w:start w:val="1"/>
+      <w:numFmt w:val="bullet"/>
+      <w:lvlText w:val=""/>
+      <w:lvlJc w:val="left"/>
+      <w:pPr>
+        <w:ind w:left="6840" w:hanging="360"/>
+      </w:pPr>
+      <w:rPr>
+        <w:rFonts w:ascii="Wingdings" w:hAnsi="Wingdings" w:hint="default"/>
+      </w:rPr>
+    </w:lvl>
+  </w:abstractNum>
+  <w:abstractNum w:abstractNumId="11" w15:restartNumberingAfterBreak="0">
     <w:nsid w:val="26D86659"/>
     <w:multiLevelType w:val="hybridMultilevel"/>
     <w:tmpl w:val="40B6E846"/>
@@ -2516,7 +5684,7 @@
       </w:rPr>
     </w:lvl>
   </w:abstractNum>
-  <w:abstractNum w:abstractNumId="6" w15:restartNumberingAfterBreak="0">
+  <w:abstractNum w:abstractNumId="12" w15:restartNumberingAfterBreak="0">
     <w:nsid w:val="32646374"/>
     <w:multiLevelType w:val="hybridMultilevel"/>
     <w:tmpl w:val="68E4880A"/>
@@ -2629,7 +5797,7 @@
       </w:rPr>
     </w:lvl>
   </w:abstractNum>
-  <w:abstractNum w:abstractNumId="7" w15:restartNumberingAfterBreak="0">
+  <w:abstractNum w:abstractNumId="13" w15:restartNumberingAfterBreak="0">
     <w:nsid w:val="331A242A"/>
     <w:multiLevelType w:val="hybridMultilevel"/>
     <w:tmpl w:val="1256EF42"/>
@@ -2742,7 +5910,7 @@
       </w:rPr>
     </w:lvl>
   </w:abstractNum>
-  <w:abstractNum w:abstractNumId="8" w15:restartNumberingAfterBreak="0">
+  <w:abstractNum w:abstractNumId="14" w15:restartNumberingAfterBreak="0">
     <w:nsid w:val="33947A89"/>
     <w:multiLevelType w:val="hybridMultilevel"/>
     <w:tmpl w:val="56602810"/>
@@ -2855,7 +6023,7 @@
       </w:rPr>
     </w:lvl>
   </w:abstractNum>
-  <w:abstractNum w:abstractNumId="9" w15:restartNumberingAfterBreak="0">
+  <w:abstractNum w:abstractNumId="15" w15:restartNumberingAfterBreak="0">
     <w:nsid w:val="37142D55"/>
     <w:multiLevelType w:val="hybridMultilevel"/>
     <w:tmpl w:val="6B0640D2"/>
@@ -2967,7 +6135,7 @@
       </w:rPr>
     </w:lvl>
   </w:abstractNum>
-  <w:abstractNum w:abstractNumId="10" w15:restartNumberingAfterBreak="0">
+  <w:abstractNum w:abstractNumId="16" w15:restartNumberingAfterBreak="0">
     <w:nsid w:val="3C8800CA"/>
     <w:multiLevelType w:val="hybridMultilevel"/>
     <w:tmpl w:val="083C3336"/>
@@ -3080,7 +6248,7 @@
       </w:rPr>
     </w:lvl>
   </w:abstractNum>
-  <w:abstractNum w:abstractNumId="11" w15:restartNumberingAfterBreak="0">
+  <w:abstractNum w:abstractNumId="17" w15:restartNumberingAfterBreak="0">
     <w:nsid w:val="3E673432"/>
     <w:multiLevelType w:val="hybridMultilevel"/>
     <w:tmpl w:val="653AD242"/>
@@ -3193,7 +6361,7 @@
       </w:rPr>
     </w:lvl>
   </w:abstractNum>
-  <w:abstractNum w:abstractNumId="12" w15:restartNumberingAfterBreak="0">
+  <w:abstractNum w:abstractNumId="18" w15:restartNumberingAfterBreak="0">
     <w:nsid w:val="3F5B5599"/>
     <w:multiLevelType w:val="hybridMultilevel"/>
     <w:tmpl w:val="DC680EC2"/>
@@ -3306,7 +6474,346 @@
       </w:rPr>
     </w:lvl>
   </w:abstractNum>
-  <w:abstractNum w:abstractNumId="13" w15:restartNumberingAfterBreak="0">
+  <w:abstractNum w:abstractNumId="19" w15:restartNumberingAfterBreak="0">
+    <w:nsid w:val="4B8F675C"/>
+    <w:multiLevelType w:val="hybridMultilevel"/>
+    <w:tmpl w:val="032CEA48"/>
+    <w:lvl w:ilvl="0" w:tplc="08090001">
+      <w:start w:val="1"/>
+      <w:numFmt w:val="bullet"/>
+      <w:lvlText w:val=""/>
+      <w:lvlJc w:val="left"/>
+      <w:pPr>
+        <w:ind w:left="720" w:hanging="360"/>
+      </w:pPr>
+      <w:rPr>
+        <w:rFonts w:ascii="Symbol" w:hAnsi="Symbol" w:hint="default"/>
+      </w:rPr>
+    </w:lvl>
+    <w:lvl w:ilvl="1" w:tplc="08090003" w:tentative="1">
+      <w:start w:val="1"/>
+      <w:numFmt w:val="bullet"/>
+      <w:lvlText w:val="o"/>
+      <w:lvlJc w:val="left"/>
+      <w:pPr>
+        <w:ind w:left="1440" w:hanging="360"/>
+      </w:pPr>
+      <w:rPr>
+        <w:rFonts w:ascii="Courier New" w:hAnsi="Courier New" w:cs="Courier New" w:hint="default"/>
+      </w:rPr>
+    </w:lvl>
+    <w:lvl w:ilvl="2" w:tplc="08090005" w:tentative="1">
+      <w:start w:val="1"/>
+      <w:numFmt w:val="bullet"/>
+      <w:lvlText w:val=""/>
+      <w:lvlJc w:val="left"/>
+      <w:pPr>
+        <w:ind w:left="2160" w:hanging="360"/>
+      </w:pPr>
+      <w:rPr>
+        <w:rFonts w:ascii="Wingdings" w:hAnsi="Wingdings" w:hint="default"/>
+      </w:rPr>
+    </w:lvl>
+    <w:lvl w:ilvl="3" w:tplc="08090001" w:tentative="1">
+      <w:start w:val="1"/>
+      <w:numFmt w:val="bullet"/>
+      <w:lvlText w:val=""/>
+      <w:lvlJc w:val="left"/>
+      <w:pPr>
+        <w:ind w:left="2880" w:hanging="360"/>
+      </w:pPr>
+      <w:rPr>
+        <w:rFonts w:ascii="Symbol" w:hAnsi="Symbol" w:hint="default"/>
+      </w:rPr>
+    </w:lvl>
+    <w:lvl w:ilvl="4" w:tplc="08090003" w:tentative="1">
+      <w:start w:val="1"/>
+      <w:numFmt w:val="bullet"/>
+      <w:lvlText w:val="o"/>
+      <w:lvlJc w:val="left"/>
+      <w:pPr>
+        <w:ind w:left="3600" w:hanging="360"/>
+      </w:pPr>
+      <w:rPr>
+        <w:rFonts w:ascii="Courier New" w:hAnsi="Courier New" w:cs="Courier New" w:hint="default"/>
+      </w:rPr>
+    </w:lvl>
+    <w:lvl w:ilvl="5" w:tplc="08090005" w:tentative="1">
+      <w:start w:val="1"/>
+      <w:numFmt w:val="bullet"/>
+      <w:lvlText w:val=""/>
+      <w:lvlJc w:val="left"/>
+      <w:pPr>
+        <w:ind w:left="4320" w:hanging="360"/>
+      </w:pPr>
+      <w:rPr>
+        <w:rFonts w:ascii="Wingdings" w:hAnsi="Wingdings" w:hint="default"/>
+      </w:rPr>
+    </w:lvl>
+    <w:lvl w:ilvl="6" w:tplc="08090001" w:tentative="1">
+      <w:start w:val="1"/>
+      <w:numFmt w:val="bullet"/>
+      <w:lvlText w:val=""/>
+      <w:lvlJc w:val="left"/>
+      <w:pPr>
+        <w:ind w:left="5040" w:hanging="360"/>
+      </w:pPr>
+      <w:rPr>
+        <w:rFonts w:ascii="Symbol" w:hAnsi="Symbol" w:hint="default"/>
+      </w:rPr>
+    </w:lvl>
+    <w:lvl w:ilvl="7" w:tplc="08090003" w:tentative="1">
+      <w:start w:val="1"/>
+      <w:numFmt w:val="bullet"/>
+      <w:lvlText w:val="o"/>
+      <w:lvlJc w:val="left"/>
+      <w:pPr>
+        <w:ind w:left="5760" w:hanging="360"/>
+      </w:pPr>
+      <w:rPr>
+        <w:rFonts w:ascii="Courier New" w:hAnsi="Courier New" w:cs="Courier New" w:hint="default"/>
+      </w:rPr>
+    </w:lvl>
+    <w:lvl w:ilvl="8" w:tplc="08090005" w:tentative="1">
+      <w:start w:val="1"/>
+      <w:numFmt w:val="bullet"/>
+      <w:lvlText w:val=""/>
+      <w:lvlJc w:val="left"/>
+      <w:pPr>
+        <w:ind w:left="6480" w:hanging="360"/>
+      </w:pPr>
+      <w:rPr>
+        <w:rFonts w:ascii="Wingdings" w:hAnsi="Wingdings" w:hint="default"/>
+      </w:rPr>
+    </w:lvl>
+  </w:abstractNum>
+  <w:abstractNum w:abstractNumId="20" w15:restartNumberingAfterBreak="0">
+    <w:nsid w:val="582E27C6"/>
+    <w:multiLevelType w:val="hybridMultilevel"/>
+    <w:tmpl w:val="137858CE"/>
+    <w:lvl w:ilvl="0" w:tplc="08090001">
+      <w:start w:val="1"/>
+      <w:numFmt w:val="bullet"/>
+      <w:lvlText w:val=""/>
+      <w:lvlJc w:val="left"/>
+      <w:pPr>
+        <w:ind w:left="1080" w:hanging="360"/>
+      </w:pPr>
+      <w:rPr>
+        <w:rFonts w:ascii="Symbol" w:hAnsi="Symbol" w:hint="default"/>
+      </w:rPr>
+    </w:lvl>
+    <w:lvl w:ilvl="1" w:tplc="08090003" w:tentative="1">
+      <w:start w:val="1"/>
+      <w:numFmt w:val="bullet"/>
+      <w:lvlText w:val="o"/>
+      <w:lvlJc w:val="left"/>
+      <w:pPr>
+        <w:ind w:left="1800" w:hanging="360"/>
+      </w:pPr>
+      <w:rPr>
+        <w:rFonts w:ascii="Courier New" w:hAnsi="Courier New" w:cs="Courier New" w:hint="default"/>
+      </w:rPr>
+    </w:lvl>
+    <w:lvl w:ilvl="2" w:tplc="08090005" w:tentative="1">
+      <w:start w:val="1"/>
+      <w:numFmt w:val="bullet"/>
+      <w:lvlText w:val=""/>
+      <w:lvlJc w:val="left"/>
+      <w:pPr>
+        <w:ind w:left="2520" w:hanging="360"/>
+      </w:pPr>
+      <w:rPr>
+        <w:rFonts w:ascii="Wingdings" w:hAnsi="Wingdings" w:hint="default"/>
+      </w:rPr>
+    </w:lvl>
+    <w:lvl w:ilvl="3" w:tplc="08090001" w:tentative="1">
+      <w:start w:val="1"/>
+      <w:numFmt w:val="bullet"/>
+      <w:lvlText w:val=""/>
+      <w:lvlJc w:val="left"/>
+      <w:pPr>
+        <w:ind w:left="3240" w:hanging="360"/>
+      </w:pPr>
+      <w:rPr>
+        <w:rFonts w:ascii="Symbol" w:hAnsi="Symbol" w:hint="default"/>
+      </w:rPr>
+    </w:lvl>
+    <w:lvl w:ilvl="4" w:tplc="08090003" w:tentative="1">
+      <w:start w:val="1"/>
+      <w:numFmt w:val="bullet"/>
+      <w:lvlText w:val="o"/>
+      <w:lvlJc w:val="left"/>
+      <w:pPr>
+        <w:ind w:left="3960" w:hanging="360"/>
+      </w:pPr>
+      <w:rPr>
+        <w:rFonts w:ascii="Courier New" w:hAnsi="Courier New" w:cs="Courier New" w:hint="default"/>
+      </w:rPr>
+    </w:lvl>
+    <w:lvl w:ilvl="5" w:tplc="08090005" w:tentative="1">
+      <w:start w:val="1"/>
+      <w:numFmt w:val="bullet"/>
+      <w:lvlText w:val=""/>
+      <w:lvlJc w:val="left"/>
+      <w:pPr>
+        <w:ind w:left="4680" w:hanging="360"/>
+      </w:pPr>
+      <w:rPr>
+        <w:rFonts w:ascii="Wingdings" w:hAnsi="Wingdings" w:hint="default"/>
+      </w:rPr>
+    </w:lvl>
+    <w:lvl w:ilvl="6" w:tplc="08090001" w:tentative="1">
+      <w:start w:val="1"/>
+      <w:numFmt w:val="bullet"/>
+      <w:lvlText w:val=""/>
+      <w:lvlJc w:val="left"/>
+      <w:pPr>
+        <w:ind w:left="5400" w:hanging="360"/>
+      </w:pPr>
+      <w:rPr>
+        <w:rFonts w:ascii="Symbol" w:hAnsi="Symbol" w:hint="default"/>
+      </w:rPr>
+    </w:lvl>
+    <w:lvl w:ilvl="7" w:tplc="08090003" w:tentative="1">
+      <w:start w:val="1"/>
+      <w:numFmt w:val="bullet"/>
+      <w:lvlText w:val="o"/>
+      <w:lvlJc w:val="left"/>
+      <w:pPr>
+        <w:ind w:left="6120" w:hanging="360"/>
+      </w:pPr>
+      <w:rPr>
+        <w:rFonts w:ascii="Courier New" w:hAnsi="Courier New" w:cs="Courier New" w:hint="default"/>
+      </w:rPr>
+    </w:lvl>
+    <w:lvl w:ilvl="8" w:tplc="08090005" w:tentative="1">
+      <w:start w:val="1"/>
+      <w:numFmt w:val="bullet"/>
+      <w:lvlText w:val=""/>
+      <w:lvlJc w:val="left"/>
+      <w:pPr>
+        <w:ind w:left="6840" w:hanging="360"/>
+      </w:pPr>
+      <w:rPr>
+        <w:rFonts w:ascii="Wingdings" w:hAnsi="Wingdings" w:hint="default"/>
+      </w:rPr>
+    </w:lvl>
+  </w:abstractNum>
+  <w:abstractNum w:abstractNumId="21" w15:restartNumberingAfterBreak="0">
+    <w:nsid w:val="63AF6D82"/>
+    <w:multiLevelType w:val="hybridMultilevel"/>
+    <w:tmpl w:val="D71ABB60"/>
+    <w:lvl w:ilvl="0" w:tplc="08090001">
+      <w:start w:val="1"/>
+      <w:numFmt w:val="bullet"/>
+      <w:lvlText w:val=""/>
+      <w:lvlJc w:val="left"/>
+      <w:pPr>
+        <w:ind w:left="1080" w:hanging="360"/>
+      </w:pPr>
+      <w:rPr>
+        <w:rFonts w:ascii="Symbol" w:hAnsi="Symbol" w:hint="default"/>
+      </w:rPr>
+    </w:lvl>
+    <w:lvl w:ilvl="1" w:tplc="FFFFFFFF" w:tentative="1">
+      <w:start w:val="1"/>
+      <w:numFmt w:val="bullet"/>
+      <w:lvlText w:val="o"/>
+      <w:lvlJc w:val="left"/>
+      <w:pPr>
+        <w:ind w:left="1800" w:hanging="360"/>
+      </w:pPr>
+      <w:rPr>
+        <w:rFonts w:ascii="Courier New" w:hAnsi="Courier New" w:cs="Courier New" w:hint="default"/>
+      </w:rPr>
+    </w:lvl>
+    <w:lvl w:ilvl="2" w:tplc="FFFFFFFF" w:tentative="1">
+      <w:start w:val="1"/>
+      <w:numFmt w:val="bullet"/>
+      <w:lvlText w:val=""/>
+      <w:lvlJc w:val="left"/>
+      <w:pPr>
+        <w:ind w:left="2520" w:hanging="360"/>
+      </w:pPr>
+      <w:rPr>
+        <w:rFonts w:ascii="Wingdings" w:hAnsi="Wingdings" w:hint="default"/>
+      </w:rPr>
+    </w:lvl>
+    <w:lvl w:ilvl="3" w:tplc="FFFFFFFF" w:tentative="1">
+      <w:start w:val="1"/>
+      <w:numFmt w:val="bullet"/>
+      <w:lvlText w:val=""/>
+      <w:lvlJc w:val="left"/>
+      <w:pPr>
+        <w:ind w:left="3240" w:hanging="360"/>
+      </w:pPr>
+      <w:rPr>
+        <w:rFonts w:ascii="Symbol" w:hAnsi="Symbol" w:hint="default"/>
+      </w:rPr>
+    </w:lvl>
+    <w:lvl w:ilvl="4" w:tplc="FFFFFFFF" w:tentative="1">
+      <w:start w:val="1"/>
+      <w:numFmt w:val="bullet"/>
+      <w:lvlText w:val="o"/>
+      <w:lvlJc w:val="left"/>
+      <w:pPr>
+        <w:ind w:left="3960" w:hanging="360"/>
+      </w:pPr>
+      <w:rPr>
+        <w:rFonts w:ascii="Courier New" w:hAnsi="Courier New" w:cs="Courier New" w:hint="default"/>
+      </w:rPr>
+    </w:lvl>
+    <w:lvl w:ilvl="5" w:tplc="FFFFFFFF" w:tentative="1">
+      <w:start w:val="1"/>
+      <w:numFmt w:val="bullet"/>
+      <w:lvlText w:val=""/>
+      <w:lvlJc w:val="left"/>
+      <w:pPr>
+        <w:ind w:left="4680" w:hanging="360"/>
+      </w:pPr>
+      <w:rPr>
+        <w:rFonts w:ascii="Wingdings" w:hAnsi="Wingdings" w:hint="default"/>
+      </w:rPr>
+    </w:lvl>
+    <w:lvl w:ilvl="6" w:tplc="FFFFFFFF" w:tentative="1">
+      <w:start w:val="1"/>
+      <w:numFmt w:val="bullet"/>
+      <w:lvlText w:val=""/>
+      <w:lvlJc w:val="left"/>
+      <w:pPr>
+        <w:ind w:left="5400" w:hanging="360"/>
+      </w:pPr>
+      <w:rPr>
+        <w:rFonts w:ascii="Symbol" w:hAnsi="Symbol" w:hint="default"/>
+      </w:rPr>
+    </w:lvl>
+    <w:lvl w:ilvl="7" w:tplc="FFFFFFFF" w:tentative="1">
+      <w:start w:val="1"/>
+      <w:numFmt w:val="bullet"/>
+      <w:lvlText w:val="o"/>
+      <w:lvlJc w:val="left"/>
+      <w:pPr>
+        <w:ind w:left="6120" w:hanging="360"/>
+      </w:pPr>
+      <w:rPr>
+        <w:rFonts w:ascii="Courier New" w:hAnsi="Courier New" w:cs="Courier New" w:hint="default"/>
+      </w:rPr>
+    </w:lvl>
+    <w:lvl w:ilvl="8" w:tplc="FFFFFFFF" w:tentative="1">
+      <w:start w:val="1"/>
+      <w:numFmt w:val="bullet"/>
+      <w:lvlText w:val=""/>
+      <w:lvlJc w:val="left"/>
+      <w:pPr>
+        <w:ind w:left="6840" w:hanging="360"/>
+      </w:pPr>
+      <w:rPr>
+        <w:rFonts w:ascii="Wingdings" w:hAnsi="Wingdings" w:hint="default"/>
+      </w:rPr>
+    </w:lvl>
+  </w:abstractNum>
+  <w:abstractNum w:abstractNumId="22" w15:restartNumberingAfterBreak="0">
     <w:nsid w:val="6B5979E8"/>
     <w:multiLevelType w:val="hybridMultilevel"/>
     <w:tmpl w:val="00F05744"/>
@@ -3419,7 +6926,7 @@
       </w:rPr>
     </w:lvl>
   </w:abstractNum>
-  <w:abstractNum w:abstractNumId="14" w15:restartNumberingAfterBreak="0">
+  <w:abstractNum w:abstractNumId="23" w15:restartNumberingAfterBreak="0">
     <w:nsid w:val="71297BC6"/>
     <w:multiLevelType w:val="hybridMultilevel"/>
     <w:tmpl w:val="7D2EA956"/>
@@ -3532,7 +7039,7 @@
       </w:rPr>
     </w:lvl>
   </w:abstractNum>
-  <w:abstractNum w:abstractNumId="15" w15:restartNumberingAfterBreak="0">
+  <w:abstractNum w:abstractNumId="24" w15:restartNumberingAfterBreak="0">
     <w:nsid w:val="71C61227"/>
     <w:multiLevelType w:val="hybridMultilevel"/>
     <w:tmpl w:val="25ACB664"/>
@@ -3645,7 +7152,7 @@
       </w:rPr>
     </w:lvl>
   </w:abstractNum>
-  <w:abstractNum w:abstractNumId="16" w15:restartNumberingAfterBreak="0">
+  <w:abstractNum w:abstractNumId="25" w15:restartNumberingAfterBreak="0">
     <w:nsid w:val="73804286"/>
     <w:multiLevelType w:val="hybridMultilevel"/>
     <w:tmpl w:val="7EDADF36"/>
@@ -3758,56 +7265,199 @@
       </w:rPr>
     </w:lvl>
   </w:abstractNum>
+  <w:abstractNum w:abstractNumId="26" w15:restartNumberingAfterBreak="0">
+    <w:nsid w:val="78B80D8C"/>
+    <w:multiLevelType w:val="hybridMultilevel"/>
+    <w:tmpl w:val="EE3289FA"/>
+    <w:lvl w:ilvl="0" w:tplc="08090003">
+      <w:start w:val="1"/>
+      <w:numFmt w:val="bullet"/>
+      <w:lvlText w:val="o"/>
+      <w:lvlJc w:val="left"/>
+      <w:pPr>
+        <w:ind w:left="360" w:hanging="360"/>
+      </w:pPr>
+      <w:rPr>
+        <w:rFonts w:ascii="Courier New" w:hAnsi="Courier New" w:cs="Courier New" w:hint="default"/>
+      </w:rPr>
+    </w:lvl>
+    <w:lvl w:ilvl="1" w:tplc="08090003" w:tentative="1">
+      <w:start w:val="1"/>
+      <w:numFmt w:val="bullet"/>
+      <w:lvlText w:val="o"/>
+      <w:lvlJc w:val="left"/>
+      <w:pPr>
+        <w:ind w:left="1080" w:hanging="360"/>
+      </w:pPr>
+      <w:rPr>
+        <w:rFonts w:ascii="Courier New" w:hAnsi="Courier New" w:cs="Courier New" w:hint="default"/>
+      </w:rPr>
+    </w:lvl>
+    <w:lvl w:ilvl="2" w:tplc="08090005" w:tentative="1">
+      <w:start w:val="1"/>
+      <w:numFmt w:val="bullet"/>
+      <w:lvlText w:val=""/>
+      <w:lvlJc w:val="left"/>
+      <w:pPr>
+        <w:ind w:left="1800" w:hanging="360"/>
+      </w:pPr>
+      <w:rPr>
+        <w:rFonts w:ascii="Wingdings" w:hAnsi="Wingdings" w:hint="default"/>
+      </w:rPr>
+    </w:lvl>
+    <w:lvl w:ilvl="3" w:tplc="08090001" w:tentative="1">
+      <w:start w:val="1"/>
+      <w:numFmt w:val="bullet"/>
+      <w:lvlText w:val=""/>
+      <w:lvlJc w:val="left"/>
+      <w:pPr>
+        <w:ind w:left="2520" w:hanging="360"/>
+      </w:pPr>
+      <w:rPr>
+        <w:rFonts w:ascii="Symbol" w:hAnsi="Symbol" w:hint="default"/>
+      </w:rPr>
+    </w:lvl>
+    <w:lvl w:ilvl="4" w:tplc="08090003" w:tentative="1">
+      <w:start w:val="1"/>
+      <w:numFmt w:val="bullet"/>
+      <w:lvlText w:val="o"/>
+      <w:lvlJc w:val="left"/>
+      <w:pPr>
+        <w:ind w:left="3240" w:hanging="360"/>
+      </w:pPr>
+      <w:rPr>
+        <w:rFonts w:ascii="Courier New" w:hAnsi="Courier New" w:cs="Courier New" w:hint="default"/>
+      </w:rPr>
+    </w:lvl>
+    <w:lvl w:ilvl="5" w:tplc="08090005" w:tentative="1">
+      <w:start w:val="1"/>
+      <w:numFmt w:val="bullet"/>
+      <w:lvlText w:val=""/>
+      <w:lvlJc w:val="left"/>
+      <w:pPr>
+        <w:ind w:left="3960" w:hanging="360"/>
+      </w:pPr>
+      <w:rPr>
+        <w:rFonts w:ascii="Wingdings" w:hAnsi="Wingdings" w:hint="default"/>
+      </w:rPr>
+    </w:lvl>
+    <w:lvl w:ilvl="6" w:tplc="08090001" w:tentative="1">
+      <w:start w:val="1"/>
+      <w:numFmt w:val="bullet"/>
+      <w:lvlText w:val=""/>
+      <w:lvlJc w:val="left"/>
+      <w:pPr>
+        <w:ind w:left="4680" w:hanging="360"/>
+      </w:pPr>
+      <w:rPr>
+        <w:rFonts w:ascii="Symbol" w:hAnsi="Symbol" w:hint="default"/>
+      </w:rPr>
+    </w:lvl>
+    <w:lvl w:ilvl="7" w:tplc="08090003" w:tentative="1">
+      <w:start w:val="1"/>
+      <w:numFmt w:val="bullet"/>
+      <w:lvlText w:val="o"/>
+      <w:lvlJc w:val="left"/>
+      <w:pPr>
+        <w:ind w:left="5400" w:hanging="360"/>
+      </w:pPr>
+      <w:rPr>
+        <w:rFonts w:ascii="Courier New" w:hAnsi="Courier New" w:cs="Courier New" w:hint="default"/>
+      </w:rPr>
+    </w:lvl>
+    <w:lvl w:ilvl="8" w:tplc="08090005" w:tentative="1">
+      <w:start w:val="1"/>
+      <w:numFmt w:val="bullet"/>
+      <w:lvlText w:val=""/>
+      <w:lvlJc w:val="left"/>
+      <w:pPr>
+        <w:ind w:left="6120" w:hanging="360"/>
+      </w:pPr>
+      <w:rPr>
+        <w:rFonts w:ascii="Wingdings" w:hAnsi="Wingdings" w:hint="default"/>
+      </w:rPr>
+    </w:lvl>
+  </w:abstractNum>
   <w:num w:numId="1" w16cid:durableId="264726552">
-    <w:abstractNumId w:val="6"/>
+    <w:abstractNumId w:val="12"/>
   </w:num>
   <w:num w:numId="2" w16cid:durableId="1117531860">
-    <w:abstractNumId w:val="4"/>
+    <w:abstractNumId w:val="9"/>
   </w:num>
   <w:num w:numId="3" w16cid:durableId="1333141373">
     <w:abstractNumId w:val="1"/>
   </w:num>
   <w:num w:numId="4" w16cid:durableId="422142366">
-    <w:abstractNumId w:val="9"/>
+    <w:abstractNumId w:val="15"/>
   </w:num>
   <w:num w:numId="5" w16cid:durableId="1080639166">
-    <w:abstractNumId w:val="8"/>
+    <w:abstractNumId w:val="14"/>
   </w:num>
   <w:num w:numId="6" w16cid:durableId="1382289761">
-    <w:abstractNumId w:val="15"/>
+    <w:abstractNumId w:val="24"/>
   </w:num>
   <w:num w:numId="7" w16cid:durableId="1693604404">
-    <w:abstractNumId w:val="10"/>
+    <w:abstractNumId w:val="16"/>
   </w:num>
   <w:num w:numId="8" w16cid:durableId="731581673">
     <w:abstractNumId w:val="0"/>
   </w:num>
   <w:num w:numId="9" w16cid:durableId="933249796">
-    <w:abstractNumId w:val="5"/>
+    <w:abstractNumId w:val="11"/>
   </w:num>
   <w:num w:numId="10" w16cid:durableId="864712655">
-    <w:abstractNumId w:val="3"/>
+    <w:abstractNumId w:val="7"/>
   </w:num>
   <w:num w:numId="11" w16cid:durableId="667559567">
-    <w:abstractNumId w:val="12"/>
+    <w:abstractNumId w:val="18"/>
   </w:num>
   <w:num w:numId="12" w16cid:durableId="1376462611">
-    <w:abstractNumId w:val="11"/>
+    <w:abstractNumId w:val="17"/>
   </w:num>
   <w:num w:numId="13" w16cid:durableId="1688750747">
-    <w:abstractNumId w:val="16"/>
+    <w:abstractNumId w:val="25"/>
   </w:num>
   <w:num w:numId="14" w16cid:durableId="1809277704">
-    <w:abstractNumId w:val="14"/>
+    <w:abstractNumId w:val="23"/>
   </w:num>
   <w:num w:numId="15" w16cid:durableId="1050154720">
-    <w:abstractNumId w:val="7"/>
+    <w:abstractNumId w:val="13"/>
   </w:num>
   <w:num w:numId="16" w16cid:durableId="181748048">
-    <w:abstractNumId w:val="13"/>
+    <w:abstractNumId w:val="22"/>
   </w:num>
   <w:num w:numId="17" w16cid:durableId="62801113">
     <w:abstractNumId w:val="2"/>
+  </w:num>
+  <w:num w:numId="18" w16cid:durableId="8527666">
+    <w:abstractNumId w:val="5"/>
+  </w:num>
+  <w:num w:numId="19" w16cid:durableId="2061979966">
+    <w:abstractNumId w:val="6"/>
+  </w:num>
+  <w:num w:numId="20" w16cid:durableId="780030282">
+    <w:abstractNumId w:val="19"/>
+  </w:num>
+  <w:num w:numId="21" w16cid:durableId="969671785">
+    <w:abstractNumId w:val="20"/>
+  </w:num>
+  <w:num w:numId="22" w16cid:durableId="1577396443">
+    <w:abstractNumId w:val="3"/>
+  </w:num>
+  <w:num w:numId="23" w16cid:durableId="1345470962">
+    <w:abstractNumId w:val="10"/>
+  </w:num>
+  <w:num w:numId="24" w16cid:durableId="799036958">
+    <w:abstractNumId w:val="4"/>
+  </w:num>
+  <w:num w:numId="25" w16cid:durableId="990711678">
+    <w:abstractNumId w:val="26"/>
+  </w:num>
+  <w:num w:numId="26" w16cid:durableId="1507132241">
+    <w:abstractNumId w:val="21"/>
+  </w:num>
+  <w:num w:numId="27" w16cid:durableId="1477188583">
+    <w:abstractNumId w:val="8"/>
   </w:num>
 </w:numbering>
 </file>
@@ -4287,7 +7937,6 @@
     <w:next w:val="Normal"/>
     <w:link w:val="Heading4Char"/>
     <w:uiPriority w:val="9"/>
-    <w:semiHidden/>
     <w:unhideWhenUsed/>
     <w:qFormat/>
     <w:rsid w:val="00F6297C"/>
@@ -4416,6 +8065,7 @@
   <w:style w:type="character" w:default="1" w:styleId="DefaultParagraphFont">
     <w:name w:val="Default Paragraph Font"/>
     <w:uiPriority w:val="1"/>
+    <w:semiHidden/>
     <w:unhideWhenUsed/>
   </w:style>
   <w:style w:type="table" w:default="1" w:styleId="TableNormal">
@@ -4485,7 +8135,6 @@
     <w:basedOn w:val="DefaultParagraphFont"/>
     <w:link w:val="Heading4"/>
     <w:uiPriority w:val="9"/>
-    <w:semiHidden/>
     <w:rsid w:val="00F6297C"/>
     <w:rPr>
       <w:rFonts w:eastAsiaTheme="majorEastAsia" w:cstheme="majorBidi"/>

</xml_diff>